<commit_message>
new file:   "certificates/semester - Temp - Ar - D - SBS - \330\257\330\247\331\206\331\212\330\247 \330\247\330\255\331\205\330\257 \330\264\331\207\330\247\330\250 \330\247\330\255\331\205\330\257.docx" 	modified:   certificates/semester - Temp - En - D - SBS - Danya Ahmed Shehab Alalwan.docx 	modified:   data/queries.py 	modified:   screens/certificate_screen.py 	modified:   templets/semester - Temp - Ar - D - SBS.docx 	renamed:    templets/semester - Temp - En - D - SBS - Copy.docx -> templets/semester - Temp - En - D - SBS.docx
</commit_message>
<xml_diff>
--- a/certificates/semester - Temp - En - D - SBS - Danya Ahmed Shehab Alalwan.docx
+++ b/certificates/semester - Temp - En - D - SBS - Danya Ahmed Shehab Alalwan.docx
@@ -6,6 +6,7 @@
       <w:pPr>
         <w:keepNext/>
         <w:bidi w:val="0"/>
+        <w:spacing w:after="0"/>
         <w:jc w:val="center"/>
         <w:rPr>
           <w:rFonts w:asciiTheme="majorBidi" w:hAnsiTheme="majorBidi" w:cstheme="majorBidi"/>
@@ -108,13 +109,14 @@
           <w:sz w:val="24"/>
           <w:szCs w:val="24"/>
         </w:rPr>
-        <w:t>Transcript Certification of Graduation</w:t>
+        <w:t>Certification of Graduation</w:t>
       </w:r>
     </w:p>
     <w:p>
       <w:pPr>
         <w:keepNext/>
         <w:bidi w:val="0"/>
+        <w:spacing w:after="0"/>
         <w:jc w:val="center"/>
         <w:rPr>
           <w:rFonts w:cs="PT Bold Heading"/>
@@ -131,7 +133,7 @@
           <w:b/>
           <w:bCs/>
         </w:rPr>
-        <w:t>To/ Whom it May Concern</w:t>
+        <w:t xml:space="preserve">To/ Whom it May Concern</w:t>
       </w:r>
     </w:p>
     <w:tbl>
@@ -174,7 +176,7 @@
               </w:rPr>
             </w:pPr>
             <w:r>
-              <w:t>Full Name: Danya Ahmed Shehab Alalwan</w:t>
+              <w:t xml:space="preserve">Full Name: Danya Ahmed Shehab Alalwan</w:t>
             </w:r>
           </w:p>
         </w:tc>
@@ -234,7 +236,7 @@
               </w:rPr>
             </w:pPr>
             <w:r>
-              <w:t>Place and Date of Birth: 2000-01-01 -غير محدد</w:t>
+              <w:t xml:space="preserve">Place and Date of Birth: 2000-01-01 -Basra</w:t>
             </w:r>
           </w:p>
         </w:tc>
@@ -256,7 +258,7 @@
               </w:rPr>
             </w:pPr>
             <w:r>
-              <w:t>Nationality: Iraq</w:t>
+              <w:t xml:space="preserve">Nationality: Iraq</w:t>
             </w:r>
           </w:p>
         </w:tc>
@@ -281,7 +283,7 @@
               </w:rPr>
             </w:pPr>
             <w:r>
-              <w:t>Year of Entrance: 2019</w:t>
+              <w:t xml:space="preserve">Year of Entrance: 2019</w:t>
             </w:r>
           </w:p>
         </w:tc>
@@ -303,7 +305,7 @@
               </w:rPr>
             </w:pPr>
             <w:r>
-              <w:t>Department: Computer Science</w:t>
+              <w:t xml:space="preserve">Department: Computer Science</w:t>
             </w:r>
           </w:p>
         </w:tc>
@@ -369,7 +371,7 @@
               </w:rPr>
             </w:pPr>
             <w:r>
-              <w:t>Study: Morning</w:t>
+              <w:t xml:space="preserve">Study: Morning</w:t>
             </w:r>
           </w:p>
         </w:tc>
@@ -394,7 +396,7 @@
               </w:rPr>
             </w:pPr>
             <w:r>
-              <w:t>Date of Graduation: 2020-11-17</w:t>
+              <w:t xml:space="preserve">Date of Graduation: 2020-11-17</w:t>
             </w:r>
           </w:p>
         </w:tc>
@@ -416,8 +418,9 @@
                 <w:lang w:bidi="ar-IQ"/>
               </w:rPr>
             </w:pPr>
-            <w:r>
-              <w:t>Semester:First</w:t>
+            <w:proofErr w:type="gramStart"/>
+            <w:r>
+              <w:t xml:space="preserve">Semester:First</w:t>
             </w:r>
           </w:p>
         </w:tc>
@@ -439,8 +442,9 @@
                 <w:lang w:bidi="ar-IQ"/>
               </w:rPr>
             </w:pPr>
-            <w:r>
-              <w:t>Average:65</w:t>
+            <w:proofErr w:type="gramStart"/>
+            <w:r>
+              <w:t xml:space="preserve">Average:65</w:t>
             </w:r>
           </w:p>
         </w:tc>
@@ -461,7 +465,7 @@
               </w:rPr>
             </w:pPr>
             <w:r>
-              <w:t>Grade: Medium</w:t>
+              <w:t xml:space="preserve">Grade: Medium</w:t>
             </w:r>
           </w:p>
         </w:tc>
@@ -478,8 +482,13 @@
               <w:bidi w:val="0"/>
               <w:spacing w:after="0"/>
             </w:pPr>
-            <w:r>
-              <w:t>Sequence_of_Graduation: 55</w:t>
+            <w:proofErr w:type="spellStart"/>
+            <w:r>
+              <w:t>Sequence_of_Graduation</w:t>
+            </w:r>
+            <w:proofErr w:type="spellEnd"/>
+            <w:r>
+              <w:t xml:space="preserve">: 55</w:t>
             </w:r>
           </w:p>
         </w:tc>
@@ -501,7 +510,7 @@
               </w:rPr>
             </w:pPr>
             <w:r>
-              <w:t>Postgraduation No.: 58</w:t>
+              <w:t xml:space="preserve">Postgraduation No.: 58</w:t>
             </w:r>
           </w:p>
         </w:tc>
@@ -517,8 +526,13 @@
               <w:bidi w:val="0"/>
               <w:spacing w:after="0"/>
             </w:pPr>
-            <w:r>
-              <w:t>Average_of_First_Student: 86</w:t>
+            <w:proofErr w:type="spellStart"/>
+            <w:r>
+              <w:t>Average_of_First_Student</w:t>
+            </w:r>
+            <w:proofErr w:type="spellEnd"/>
+            <w:r>
+              <w:t xml:space="preserve">: 86</w:t>
             </w:r>
           </w:p>
         </w:tc>
@@ -571,7 +585,7 @@
           <w:sz w:val="20"/>
           <w:szCs w:val="20"/>
         </w:rPr>
-        <w:t>Below</w:t>
+        <w:t xml:space="preserve">Below</w:t>
       </w:r>
       <w:r>
         <w:rPr>
@@ -591,6 +605,9 @@
         <w:bidi w:val="0"/>
         <w:spacing w:line="240" w:lineRule="auto"/>
       </w:pPr>
+      <w:r>
+        <w:t xml:space="preserve"/>
+      </w:r>
     </w:p>
     <w:tbl>
       <w:tblPr>
@@ -634,7 +651,7 @@
                 <w:sz w:val="18"/>
                 <w:szCs w:val="18"/>
               </w:rPr>
-              <w:t>Semester 1 - 2015-2016</w:t>
+              <w:t xml:space="preserve">Semester 1 - 2015-2016</w:t>
             </w:r>
           </w:p>
         </w:tc>
@@ -661,7 +678,7 @@
                 <w:sz w:val="18"/>
                 <w:szCs w:val="18"/>
               </w:rPr>
-              <w:t>Semester 2 - 2015-2016</w:t>
+              <w:t xml:space="preserve">Semester 2 - 2015-2016</w:t>
             </w:r>
           </w:p>
         </w:tc>
@@ -822,7 +839,7 @@
                 <w:sz w:val="18"/>
                 <w:szCs w:val="18"/>
               </w:rPr>
-              <w:t>Unit</w:t>
+              <w:t xml:space="preserve">Unit</w:t>
             </w:r>
           </w:p>
         </w:tc>
@@ -853,7 +870,7 @@
                 <w:sz w:val="18"/>
                 <w:szCs w:val="18"/>
               </w:rPr>
-              <w:t>First Aid</w:t>
+              <w:t xml:space="preserve">First Aid</w:t>
             </w:r>
           </w:p>
         </w:tc>
@@ -879,7 +896,7 @@
                 <w:sz w:val="18"/>
                 <w:szCs w:val="18"/>
               </w:rPr>
-              <w:t>78.0</w:t>
+              <w:t xml:space="preserve">78.0</w:t>
             </w:r>
           </w:p>
         </w:tc>
@@ -905,7 +922,7 @@
                 <w:sz w:val="18"/>
                 <w:szCs w:val="18"/>
               </w:rPr>
-              <w:t>2</w:t>
+              <w:t xml:space="preserve">2</w:t>
             </w:r>
           </w:p>
         </w:tc>
@@ -931,7 +948,7 @@
                 <w:sz w:val="18"/>
                 <w:szCs w:val="18"/>
               </w:rPr>
-              <w:t>Computer Ethics</w:t>
+              <w:t xml:space="preserve">Computer Ethics</w:t>
             </w:r>
           </w:p>
         </w:tc>
@@ -957,7 +974,7 @@
                 <w:sz w:val="18"/>
                 <w:szCs w:val="18"/>
               </w:rPr>
-              <w:t>53.0</w:t>
+              <w:t xml:space="preserve">53.0</w:t>
             </w:r>
           </w:p>
         </w:tc>
@@ -983,7 +1000,7 @@
                 <w:sz w:val="18"/>
                 <w:szCs w:val="18"/>
               </w:rPr>
-              <w:t>2</w:t>
+              <w:t xml:space="preserve">2</w:t>
             </w:r>
           </w:p>
         </w:tc>
@@ -1014,7 +1031,7 @@
                 <w:sz w:val="18"/>
                 <w:szCs w:val="18"/>
               </w:rPr>
-              <w:t>Programming I</w:t>
+              <w:t xml:space="preserve">Programming I</w:t>
             </w:r>
           </w:p>
         </w:tc>
@@ -1040,7 +1057,7 @@
                 <w:sz w:val="18"/>
                 <w:szCs w:val="18"/>
               </w:rPr>
-              <w:t>56.0</w:t>
+              <w:t xml:space="preserve">56.0</w:t>
             </w:r>
           </w:p>
         </w:tc>
@@ -1066,7 +1083,7 @@
                 <w:sz w:val="18"/>
                 <w:szCs w:val="18"/>
               </w:rPr>
-              <w:t>4</w:t>
+              <w:t xml:space="preserve">4</w:t>
             </w:r>
           </w:p>
         </w:tc>
@@ -1092,7 +1109,7 @@
                 <w:sz w:val="18"/>
                 <w:szCs w:val="18"/>
               </w:rPr>
-              <w:t>Democracy Education</w:t>
+              <w:t xml:space="preserve">Democracy Education</w:t>
             </w:r>
           </w:p>
         </w:tc>
@@ -1118,7 +1135,7 @@
                 <w:sz w:val="18"/>
                 <w:szCs w:val="18"/>
               </w:rPr>
-              <w:t>83.0</w:t>
+              <w:t xml:space="preserve">83.0</w:t>
             </w:r>
           </w:p>
         </w:tc>
@@ -1144,7 +1161,7 @@
                 <w:sz w:val="18"/>
                 <w:szCs w:val="18"/>
               </w:rPr>
-              <w:t>1</w:t>
+              <w:t xml:space="preserve">1</w:t>
             </w:r>
           </w:p>
         </w:tc>
@@ -1175,7 +1192,7 @@
                 <w:sz w:val="18"/>
                 <w:szCs w:val="18"/>
               </w:rPr>
-              <w:t>Logic Design</w:t>
+              <w:t xml:space="preserve">Logic Design</w:t>
             </w:r>
           </w:p>
         </w:tc>
@@ -1201,7 +1218,7 @@
                 <w:sz w:val="18"/>
                 <w:szCs w:val="18"/>
               </w:rPr>
-              <w:t>53.0</w:t>
+              <w:t xml:space="preserve">53.0</w:t>
             </w:r>
           </w:p>
         </w:tc>
@@ -1227,7 +1244,7 @@
                 <w:sz w:val="18"/>
                 <w:szCs w:val="18"/>
               </w:rPr>
-              <w:t>3</w:t>
+              <w:t xml:space="preserve">3</w:t>
             </w:r>
           </w:p>
         </w:tc>
@@ -1253,7 +1270,7 @@
                 <w:sz w:val="18"/>
                 <w:szCs w:val="18"/>
               </w:rPr>
-              <w:t>English Language I</w:t>
+              <w:t xml:space="preserve">English Language I</w:t>
             </w:r>
           </w:p>
         </w:tc>
@@ -1279,7 +1296,7 @@
                 <w:sz w:val="18"/>
                 <w:szCs w:val="18"/>
               </w:rPr>
-              <w:t>75.0</w:t>
+              <w:t xml:space="preserve">75.0</w:t>
             </w:r>
           </w:p>
         </w:tc>
@@ -1305,7 +1322,7 @@
                 <w:sz w:val="18"/>
                 <w:szCs w:val="18"/>
               </w:rPr>
-              <w:t>2</w:t>
+              <w:t xml:space="preserve">2</w:t>
             </w:r>
           </w:p>
         </w:tc>
@@ -1336,7 +1353,7 @@
                 <w:sz w:val="18"/>
                 <w:szCs w:val="18"/>
               </w:rPr>
-              <w:t>Sport</w:t>
+              <w:t xml:space="preserve">Sport</w:t>
             </w:r>
           </w:p>
         </w:tc>
@@ -1362,7 +1379,7 @@
                 <w:sz w:val="18"/>
                 <w:szCs w:val="18"/>
               </w:rPr>
-              <w:t>71.0</w:t>
+              <w:t xml:space="preserve">71.0</w:t>
             </w:r>
           </w:p>
         </w:tc>
@@ -1388,7 +1405,7 @@
                 <w:sz w:val="18"/>
                 <w:szCs w:val="18"/>
               </w:rPr>
-              <w:t>1</w:t>
+              <w:t xml:space="preserve">1</w:t>
             </w:r>
           </w:p>
         </w:tc>
@@ -1414,7 +1431,7 @@
                 <w:sz w:val="18"/>
                 <w:szCs w:val="18"/>
               </w:rPr>
-              <w:t>Discrete Structures</w:t>
+              <w:t xml:space="preserve">Discrete Structures</w:t>
             </w:r>
           </w:p>
         </w:tc>
@@ -1440,7 +1457,7 @@
                 <w:sz w:val="18"/>
                 <w:szCs w:val="18"/>
               </w:rPr>
-              <w:t>50.0</w:t>
+              <w:t xml:space="preserve">50.0</w:t>
             </w:r>
           </w:p>
         </w:tc>
@@ -1466,7 +1483,7 @@
                 <w:sz w:val="18"/>
                 <w:szCs w:val="18"/>
               </w:rPr>
-              <w:t>3</w:t>
+              <w:t xml:space="preserve">3</w:t>
             </w:r>
           </w:p>
         </w:tc>
@@ -1497,7 +1514,7 @@
                 <w:sz w:val="18"/>
                 <w:szCs w:val="18"/>
               </w:rPr>
-              <w:t>Mathematics for Computing</w:t>
+              <w:t xml:space="preserve">Mathematics for Computing</w:t>
             </w:r>
           </w:p>
         </w:tc>
@@ -1523,7 +1540,7 @@
                 <w:sz w:val="18"/>
                 <w:szCs w:val="18"/>
               </w:rPr>
-              <w:t>60.0</w:t>
+              <w:t xml:space="preserve">60.0</w:t>
             </w:r>
           </w:p>
         </w:tc>
@@ -1549,7 +1566,7 @@
                 <w:sz w:val="18"/>
                 <w:szCs w:val="18"/>
               </w:rPr>
-              <w:t>3</w:t>
+              <w:t xml:space="preserve">3</w:t>
             </w:r>
           </w:p>
         </w:tc>
@@ -1575,7 +1592,7 @@
                 <w:sz w:val="18"/>
                 <w:szCs w:val="18"/>
               </w:rPr>
-              <w:t>Computer Applications</w:t>
+              <w:t xml:space="preserve">Computer Applications</w:t>
             </w:r>
           </w:p>
         </w:tc>
@@ -1601,7 +1618,7 @@
                 <w:sz w:val="18"/>
                 <w:szCs w:val="18"/>
               </w:rPr>
-              <w:t>61.0</w:t>
+              <w:t xml:space="preserve">61.0</w:t>
             </w:r>
           </w:p>
         </w:tc>
@@ -1627,7 +1644,7 @@
                 <w:sz w:val="18"/>
                 <w:szCs w:val="18"/>
               </w:rPr>
-              <w:t>2</w:t>
+              <w:t xml:space="preserve">2</w:t>
             </w:r>
           </w:p>
         </w:tc>
@@ -1658,7 +1675,7 @@
                 <w:sz w:val="18"/>
                 <w:szCs w:val="18"/>
               </w:rPr>
-              <w:t>Arabic Language</w:t>
+              <w:t xml:space="preserve">Arabic Language</w:t>
             </w:r>
           </w:p>
         </w:tc>
@@ -1684,7 +1701,7 @@
                 <w:sz w:val="18"/>
                 <w:szCs w:val="18"/>
               </w:rPr>
-              <w:t>63.0</w:t>
+              <w:t xml:space="preserve">63.0</w:t>
             </w:r>
           </w:p>
         </w:tc>
@@ -1710,7 +1727,7 @@
                 <w:sz w:val="18"/>
                 <w:szCs w:val="18"/>
               </w:rPr>
-              <w:t>2</w:t>
+              <w:t xml:space="preserve">2</w:t>
             </w:r>
           </w:p>
         </w:tc>
@@ -1736,7 +1753,7 @@
                 <w:sz w:val="18"/>
                 <w:szCs w:val="18"/>
               </w:rPr>
-              <w:t>Principles of Information Technology</w:t>
+              <w:t xml:space="preserve">Principles of Information Technology</w:t>
             </w:r>
           </w:p>
         </w:tc>
@@ -1762,7 +1779,7 @@
                 <w:sz w:val="18"/>
                 <w:szCs w:val="18"/>
               </w:rPr>
-              <w:t>50.0</w:t>
+              <w:t xml:space="preserve">50.0</w:t>
             </w:r>
           </w:p>
         </w:tc>
@@ -1788,7 +1805,7 @@
                 <w:sz w:val="18"/>
                 <w:szCs w:val="18"/>
               </w:rPr>
-              <w:t>3</w:t>
+              <w:t xml:space="preserve">3</w:t>
             </w:r>
           </w:p>
         </w:tc>
@@ -1819,7 +1836,7 @@
                 <w:sz w:val="18"/>
                 <w:szCs w:val="18"/>
               </w:rPr>
-              <w:t>Computer Skills</w:t>
+              <w:t xml:space="preserve">Computer Skills</w:t>
             </w:r>
           </w:p>
         </w:tc>
@@ -1845,7 +1862,7 @@
                 <w:sz w:val="18"/>
                 <w:szCs w:val="18"/>
               </w:rPr>
-              <w:t>58.0</w:t>
+              <w:t xml:space="preserve">58.0</w:t>
             </w:r>
           </w:p>
         </w:tc>
@@ -1871,7 +1888,7 @@
                 <w:sz w:val="18"/>
                 <w:szCs w:val="18"/>
               </w:rPr>
-              <w:t>2</w:t>
+              <w:t xml:space="preserve">2</w:t>
             </w:r>
           </w:p>
         </w:tc>
@@ -1891,6 +1908,14 @@
                 <w:szCs w:val="18"/>
               </w:rPr>
             </w:pPr>
+            <w:r>
+              <w:rPr>
+                <w:rFonts w:asciiTheme="majorBidi" w:hAnsiTheme="majorBidi" w:cstheme="majorBidi"/>
+                <w:sz w:val="18"/>
+                <w:szCs w:val="18"/>
+              </w:rPr>
+              <w:t xml:space="preserve"/>
+            </w:r>
           </w:p>
         </w:tc>
         <w:tc>
@@ -1909,6 +1934,14 @@
                 <w:szCs w:val="18"/>
               </w:rPr>
             </w:pPr>
+            <w:r>
+              <w:rPr>
+                <w:rFonts w:asciiTheme="majorBidi" w:hAnsiTheme="majorBidi" w:cstheme="majorBidi"/>
+                <w:sz w:val="18"/>
+                <w:szCs w:val="18"/>
+              </w:rPr>
+              <w:t xml:space="preserve"/>
+            </w:r>
           </w:p>
         </w:tc>
         <w:tc>
@@ -1927,6 +1960,14 @@
                 <w:szCs w:val="18"/>
               </w:rPr>
             </w:pPr>
+            <w:r>
+              <w:rPr>
+                <w:rFonts w:asciiTheme="majorBidi" w:hAnsiTheme="majorBidi" w:cstheme="majorBidi"/>
+                <w:sz w:val="18"/>
+                <w:szCs w:val="18"/>
+              </w:rPr>
+              <w:t xml:space="preserve"/>
+            </w:r>
           </w:p>
         </w:tc>
       </w:tr>
@@ -1938,6 +1979,9 @@
         <w:bidi w:val="0"/>
         <w:spacing w:line="240" w:lineRule="auto"/>
       </w:pPr>
+      <w:r>
+        <w:t xml:space="preserve"/>
+      </w:r>
     </w:p>
     <w:tbl>
       <w:tblPr>
@@ -1981,7 +2025,7 @@
                 <w:sz w:val="18"/>
                 <w:szCs w:val="18"/>
               </w:rPr>
-              <w:t>Semester 3 - 2016-2017</w:t>
+              <w:t xml:space="preserve">Semester 3 - 2016-2017</w:t>
             </w:r>
           </w:p>
         </w:tc>
@@ -2008,7 +2052,7 @@
                 <w:sz w:val="18"/>
                 <w:szCs w:val="18"/>
               </w:rPr>
-              <w:t>Semester 4 - 2016-2017</w:t>
+              <w:t xml:space="preserve">Semester 4 - 2016-2017</w:t>
             </w:r>
           </w:p>
         </w:tc>
@@ -2169,7 +2213,7 @@
                 <w:sz w:val="18"/>
                 <w:szCs w:val="18"/>
               </w:rPr>
-              <w:t>Unit</w:t>
+              <w:t xml:space="preserve">Unit</w:t>
             </w:r>
           </w:p>
         </w:tc>
@@ -2200,7 +2244,7 @@
                 <w:sz w:val="18"/>
                 <w:szCs w:val="18"/>
               </w:rPr>
-              <w:t>Programming II</w:t>
+              <w:t xml:space="preserve">Programming II</w:t>
             </w:r>
           </w:p>
         </w:tc>
@@ -2226,7 +2270,7 @@
                 <w:sz w:val="18"/>
                 <w:szCs w:val="18"/>
               </w:rPr>
-              <w:t>50.0</w:t>
+              <w:t xml:space="preserve">50.0</w:t>
             </w:r>
           </w:p>
         </w:tc>
@@ -2252,7 +2296,7 @@
                 <w:sz w:val="18"/>
                 <w:szCs w:val="18"/>
               </w:rPr>
-              <w:t>4</w:t>
+              <w:t xml:space="preserve">4</w:t>
             </w:r>
           </w:p>
         </w:tc>
@@ -2278,7 +2322,7 @@
                 <w:sz w:val="18"/>
                 <w:szCs w:val="18"/>
               </w:rPr>
-              <w:t>Visual Programming</w:t>
+              <w:t xml:space="preserve">Visual Programming</w:t>
             </w:r>
           </w:p>
         </w:tc>
@@ -2304,7 +2348,7 @@
                 <w:sz w:val="18"/>
                 <w:szCs w:val="18"/>
               </w:rPr>
-              <w:t>50.0</w:t>
+              <w:t xml:space="preserve">50.0</w:t>
             </w:r>
           </w:p>
         </w:tc>
@@ -2330,7 +2374,7 @@
                 <w:sz w:val="18"/>
                 <w:szCs w:val="18"/>
               </w:rPr>
-              <w:t>3</w:t>
+              <w:t xml:space="preserve">3</w:t>
             </w:r>
           </w:p>
         </w:tc>
@@ -2361,7 +2405,7 @@
                 <w:sz w:val="18"/>
                 <w:szCs w:val="18"/>
               </w:rPr>
-              <w:t>Human Rights</w:t>
+              <w:t xml:space="preserve">Human Rights</w:t>
             </w:r>
           </w:p>
         </w:tc>
@@ -2387,7 +2431,7 @@
                 <w:sz w:val="18"/>
                 <w:szCs w:val="18"/>
               </w:rPr>
-              <w:t>53.0</w:t>
+              <w:t xml:space="preserve">53.0</w:t>
             </w:r>
           </w:p>
         </w:tc>
@@ -2413,7 +2457,7 @@
                 <w:sz w:val="18"/>
                 <w:szCs w:val="18"/>
               </w:rPr>
-              <w:t>1</w:t>
+              <w:t xml:space="preserve">1</w:t>
             </w:r>
           </w:p>
         </w:tc>
@@ -2439,7 +2483,7 @@
                 <w:sz w:val="18"/>
                 <w:szCs w:val="18"/>
               </w:rPr>
-              <w:t>Computer Graphics 2D</w:t>
+              <w:t xml:space="preserve">Computer Graphics 2D</w:t>
             </w:r>
           </w:p>
         </w:tc>
@@ -2465,7 +2509,7 @@
                 <w:sz w:val="18"/>
                 <w:szCs w:val="18"/>
               </w:rPr>
-              <w:t>74.0</w:t>
+              <w:t xml:space="preserve">74.0</w:t>
             </w:r>
           </w:p>
         </w:tc>
@@ -2491,7 +2535,7 @@
                 <w:sz w:val="18"/>
                 <w:szCs w:val="18"/>
               </w:rPr>
-              <w:t>3</w:t>
+              <w:t xml:space="preserve">3</w:t>
             </w:r>
           </w:p>
         </w:tc>
@@ -2522,7 +2566,7 @@
                 <w:sz w:val="18"/>
                 <w:szCs w:val="18"/>
               </w:rPr>
-              <w:t>Numerical Methods</w:t>
+              <w:t xml:space="preserve">Numerical Methods</w:t>
             </w:r>
           </w:p>
         </w:tc>
@@ -2548,7 +2592,7 @@
                 <w:sz w:val="18"/>
                 <w:szCs w:val="18"/>
               </w:rPr>
-              <w:t>67.0</w:t>
+              <w:t xml:space="preserve">67.0</w:t>
             </w:r>
           </w:p>
         </w:tc>
@@ -2574,7 +2618,7 @@
                 <w:sz w:val="18"/>
                 <w:szCs w:val="18"/>
               </w:rPr>
-              <w:t>3</w:t>
+              <w:t xml:space="preserve">3</w:t>
             </w:r>
           </w:p>
         </w:tc>
@@ -2600,7 +2644,7 @@
                 <w:sz w:val="18"/>
                 <w:szCs w:val="18"/>
               </w:rPr>
-              <w:t>Programming Logic Controller</w:t>
+              <w:t xml:space="preserve">Programming Logic Controller</w:t>
             </w:r>
           </w:p>
         </w:tc>
@@ -2626,7 +2670,7 @@
                 <w:sz w:val="18"/>
                 <w:szCs w:val="18"/>
               </w:rPr>
-              <w:t>62.0</w:t>
+              <w:t xml:space="preserve">62.0</w:t>
             </w:r>
           </w:p>
         </w:tc>
@@ -2652,7 +2696,7 @@
                 <w:sz w:val="18"/>
                 <w:szCs w:val="18"/>
               </w:rPr>
-              <w:t>3</w:t>
+              <w:t xml:space="preserve">3</w:t>
             </w:r>
           </w:p>
         </w:tc>
@@ -2683,7 +2727,7 @@
                 <w:sz w:val="18"/>
                 <w:szCs w:val="18"/>
               </w:rPr>
-              <w:t>Microprocessors and Assembly Language</w:t>
+              <w:t xml:space="preserve">Microprocessors and Assembly Language</w:t>
             </w:r>
           </w:p>
         </w:tc>
@@ -2709,7 +2753,7 @@
                 <w:sz w:val="18"/>
                 <w:szCs w:val="18"/>
               </w:rPr>
-              <w:t>56.0</w:t>
+              <w:t xml:space="preserve">56.0</w:t>
             </w:r>
           </w:p>
         </w:tc>
@@ -2735,7 +2779,7 @@
                 <w:sz w:val="18"/>
                 <w:szCs w:val="18"/>
               </w:rPr>
-              <w:t>3</w:t>
+              <w:t xml:space="preserve">3</w:t>
             </w:r>
           </w:p>
         </w:tc>
@@ -2761,7 +2805,7 @@
                 <w:sz w:val="18"/>
                 <w:szCs w:val="18"/>
               </w:rPr>
-              <w:t>Computation Theory</w:t>
+              <w:t xml:space="preserve">Computation Theory</w:t>
             </w:r>
           </w:p>
         </w:tc>
@@ -2787,7 +2831,7 @@
                 <w:sz w:val="18"/>
                 <w:szCs w:val="18"/>
               </w:rPr>
-              <w:t>61.0</w:t>
+              <w:t xml:space="preserve">61.0</w:t>
             </w:r>
           </w:p>
         </w:tc>
@@ -2813,7 +2857,7 @@
                 <w:sz w:val="18"/>
                 <w:szCs w:val="18"/>
               </w:rPr>
-              <w:t>3</w:t>
+              <w:t xml:space="preserve">3</w:t>
             </w:r>
           </w:p>
         </w:tc>
@@ -2844,7 +2888,7 @@
                 <w:sz w:val="18"/>
                 <w:szCs w:val="18"/>
               </w:rPr>
-              <w:t>Probability and Statistics</w:t>
+              <w:t xml:space="preserve">Probability and Statistics</w:t>
             </w:r>
           </w:p>
         </w:tc>
@@ -2870,7 +2914,7 @@
                 <w:sz w:val="18"/>
                 <w:szCs w:val="18"/>
               </w:rPr>
-              <w:t>50.0</w:t>
+              <w:t xml:space="preserve">50.0</w:t>
             </w:r>
           </w:p>
         </w:tc>
@@ -2896,7 +2940,7 @@
                 <w:sz w:val="18"/>
                 <w:szCs w:val="18"/>
               </w:rPr>
-              <w:t>3</w:t>
+              <w:t xml:space="preserve">3</w:t>
             </w:r>
           </w:p>
         </w:tc>
@@ -2922,7 +2966,7 @@
                 <w:sz w:val="18"/>
                 <w:szCs w:val="18"/>
               </w:rPr>
-              <w:t>Computer Applications in Business</w:t>
+              <w:t xml:space="preserve">Computer Applications in Business</w:t>
             </w:r>
           </w:p>
         </w:tc>
@@ -2948,7 +2992,7 @@
                 <w:sz w:val="18"/>
                 <w:szCs w:val="18"/>
               </w:rPr>
-              <w:t>64.0</w:t>
+              <w:t xml:space="preserve">64.0</w:t>
             </w:r>
           </w:p>
         </w:tc>
@@ -2974,7 +3018,7 @@
                 <w:sz w:val="18"/>
                 <w:szCs w:val="18"/>
               </w:rPr>
-              <w:t>2</w:t>
+              <w:t xml:space="preserve">2</w:t>
             </w:r>
           </w:p>
         </w:tc>
@@ -2999,6 +3043,14 @@
                 <w:szCs w:val="18"/>
               </w:rPr>
             </w:pPr>
+            <w:r>
+              <w:rPr>
+                <w:rFonts w:asciiTheme="majorBidi" w:hAnsiTheme="majorBidi" w:cstheme="majorBidi"/>
+                <w:sz w:val="18"/>
+                <w:szCs w:val="18"/>
+              </w:rPr>
+              <w:t xml:space="preserve"/>
+            </w:r>
           </w:p>
         </w:tc>
         <w:tc>
@@ -3017,6 +3069,14 @@
                 <w:szCs w:val="18"/>
               </w:rPr>
             </w:pPr>
+            <w:r>
+              <w:rPr>
+                <w:rFonts w:asciiTheme="majorBidi" w:hAnsiTheme="majorBidi" w:cstheme="majorBidi"/>
+                <w:sz w:val="18"/>
+                <w:szCs w:val="18"/>
+              </w:rPr>
+              <w:t xml:space="preserve"/>
+            </w:r>
           </w:p>
         </w:tc>
         <w:tc>
@@ -3035,6 +3095,14 @@
                 <w:szCs w:val="18"/>
               </w:rPr>
             </w:pPr>
+            <w:r>
+              <w:rPr>
+                <w:rFonts w:asciiTheme="majorBidi" w:hAnsiTheme="majorBidi" w:cstheme="majorBidi"/>
+                <w:sz w:val="18"/>
+                <w:szCs w:val="18"/>
+              </w:rPr>
+              <w:t xml:space="preserve"/>
+            </w:r>
           </w:p>
         </w:tc>
         <w:tc>
@@ -3059,7 +3127,7 @@
                 <w:sz w:val="18"/>
                 <w:szCs w:val="18"/>
               </w:rPr>
-              <w:t>Human Interaction with Computer</w:t>
+              <w:t xml:space="preserve">Human Interaction with Computer</w:t>
             </w:r>
           </w:p>
         </w:tc>
@@ -3085,7 +3153,7 @@
                 <w:sz w:val="18"/>
                 <w:szCs w:val="18"/>
               </w:rPr>
-              <w:t>79.0</w:t>
+              <w:t xml:space="preserve">79.0</w:t>
             </w:r>
           </w:p>
         </w:tc>
@@ -3111,7 +3179,7 @@
                 <w:sz w:val="18"/>
                 <w:szCs w:val="18"/>
               </w:rPr>
-              <w:t>2</w:t>
+              <w:t xml:space="preserve">2</w:t>
             </w:r>
           </w:p>
         </w:tc>
@@ -3124,6 +3192,9 @@
         <w:bidi w:val="0"/>
         <w:spacing w:line="240" w:lineRule="auto"/>
       </w:pPr>
+      <w:r>
+        <w:t xml:space="preserve"/>
+      </w:r>
     </w:p>
     <w:tbl>
       <w:tblPr>
@@ -3167,7 +3238,7 @@
                 <w:sz w:val="18"/>
                 <w:szCs w:val="18"/>
               </w:rPr>
-              <w:t>Semester 5 - 2017-2018</w:t>
+              <w:t xml:space="preserve">Semester 5 - 2017-2018</w:t>
             </w:r>
           </w:p>
         </w:tc>
@@ -3194,7 +3265,7 @@
                 <w:sz w:val="18"/>
                 <w:szCs w:val="18"/>
               </w:rPr>
-              <w:t>Semester 6 - 2017-2018</w:t>
+              <w:t xml:space="preserve">Semester 6 - 2017-2018</w:t>
             </w:r>
           </w:p>
         </w:tc>
@@ -3355,7 +3426,7 @@
                 <w:sz w:val="18"/>
                 <w:szCs w:val="18"/>
               </w:rPr>
-              <w:t>Unit</w:t>
+              <w:t xml:space="preserve">Unit</w:t>
             </w:r>
           </w:p>
         </w:tc>
@@ -3386,7 +3457,7 @@
                 <w:sz w:val="18"/>
                 <w:szCs w:val="18"/>
               </w:rPr>
-              <w:t>Fundamentals of Databases</w:t>
+              <w:t xml:space="preserve">Fundamentals of Databases</w:t>
             </w:r>
           </w:p>
         </w:tc>
@@ -3412,7 +3483,7 @@
                 <w:sz w:val="18"/>
                 <w:szCs w:val="18"/>
               </w:rPr>
-              <w:t>53.0</w:t>
+              <w:t xml:space="preserve">53.0</w:t>
             </w:r>
           </w:p>
         </w:tc>
@@ -3438,7 +3509,7 @@
                 <w:sz w:val="18"/>
                 <w:szCs w:val="18"/>
               </w:rPr>
-              <w:t>3</w:t>
+              <w:t xml:space="preserve">3</w:t>
             </w:r>
           </w:p>
         </w:tc>
@@ -3464,7 +3535,7 @@
                 <w:sz w:val="18"/>
                 <w:szCs w:val="18"/>
               </w:rPr>
-              <w:t>Fundamentals of Artificial Intelligence</w:t>
+              <w:t xml:space="preserve">Fundamentals of Artificial Intelligence</w:t>
             </w:r>
           </w:p>
         </w:tc>
@@ -3490,7 +3561,7 @@
                 <w:sz w:val="18"/>
                 <w:szCs w:val="18"/>
               </w:rPr>
-              <w:t>50.0</w:t>
+              <w:t xml:space="preserve">50.0</w:t>
             </w:r>
           </w:p>
         </w:tc>
@@ -3516,7 +3587,7 @@
                 <w:sz w:val="18"/>
                 <w:szCs w:val="18"/>
               </w:rPr>
-              <w:t>3</w:t>
+              <w:t xml:space="preserve">3</w:t>
             </w:r>
           </w:p>
         </w:tc>
@@ -3547,7 +3618,7 @@
                 <w:sz w:val="18"/>
                 <w:szCs w:val="18"/>
               </w:rPr>
-              <w:t>Object Oriented Programming</w:t>
+              <w:t xml:space="preserve">Object Oriented Programming</w:t>
             </w:r>
           </w:p>
         </w:tc>
@@ -3573,7 +3644,7 @@
                 <w:sz w:val="18"/>
                 <w:szCs w:val="18"/>
               </w:rPr>
-              <w:t>66.0</w:t>
+              <w:t xml:space="preserve">66.0</w:t>
             </w:r>
           </w:p>
         </w:tc>
@@ -3599,7 +3670,7 @@
                 <w:sz w:val="18"/>
                 <w:szCs w:val="18"/>
               </w:rPr>
-              <w:t>3</w:t>
+              <w:t xml:space="preserve">3</w:t>
             </w:r>
           </w:p>
         </w:tc>
@@ -3625,7 +3696,7 @@
                 <w:sz w:val="18"/>
                 <w:szCs w:val="18"/>
               </w:rPr>
-              <w:t>Compilers</w:t>
+              <w:t xml:space="preserve">Compilers</w:t>
             </w:r>
           </w:p>
         </w:tc>
@@ -3651,7 +3722,7 @@
                 <w:sz w:val="18"/>
                 <w:szCs w:val="18"/>
               </w:rPr>
-              <w:t>58.0</w:t>
+              <w:t xml:space="preserve">58.0</w:t>
             </w:r>
           </w:p>
         </w:tc>
@@ -3677,7 +3748,7 @@
                 <w:sz w:val="18"/>
                 <w:szCs w:val="18"/>
               </w:rPr>
-              <w:t>4</w:t>
+              <w:t xml:space="preserve">4</w:t>
             </w:r>
           </w:p>
         </w:tc>
@@ -3708,7 +3779,7 @@
                 <w:sz w:val="18"/>
                 <w:szCs w:val="18"/>
               </w:rPr>
-              <w:t>Philosophy</w:t>
+              <w:t xml:space="preserve">Philosophy</w:t>
             </w:r>
           </w:p>
         </w:tc>
@@ -3734,7 +3805,7 @@
                 <w:sz w:val="18"/>
                 <w:szCs w:val="18"/>
               </w:rPr>
-              <w:t>59.0</w:t>
+              <w:t xml:space="preserve">59.0</w:t>
             </w:r>
           </w:p>
         </w:tc>
@@ -3760,7 +3831,7 @@
                 <w:sz w:val="18"/>
                 <w:szCs w:val="18"/>
               </w:rPr>
-              <w:t>2</w:t>
+              <w:t xml:space="preserve">2</w:t>
             </w:r>
           </w:p>
         </w:tc>
@@ -3786,7 +3857,7 @@
                 <w:sz w:val="18"/>
                 <w:szCs w:val="18"/>
               </w:rPr>
-              <w:t>Computer Modeling and Simulation</w:t>
+              <w:t xml:space="preserve">Computer Modeling and Simulation</w:t>
             </w:r>
           </w:p>
         </w:tc>
@@ -3812,7 +3883,7 @@
                 <w:sz w:val="18"/>
                 <w:szCs w:val="18"/>
               </w:rPr>
-              <w:t>78.0</w:t>
+              <w:t xml:space="preserve">78.0</w:t>
             </w:r>
           </w:p>
         </w:tc>
@@ -3838,7 +3909,7 @@
                 <w:sz w:val="18"/>
                 <w:szCs w:val="18"/>
               </w:rPr>
-              <w:t>3</w:t>
+              <w:t xml:space="preserve">3</w:t>
             </w:r>
           </w:p>
         </w:tc>
@@ -3869,7 +3940,7 @@
                 <w:sz w:val="18"/>
                 <w:szCs w:val="18"/>
               </w:rPr>
-              <w:t>Operations Research</w:t>
+              <w:t xml:space="preserve">Operations Research</w:t>
             </w:r>
           </w:p>
         </w:tc>
@@ -3895,7 +3966,7 @@
                 <w:sz w:val="18"/>
                 <w:szCs w:val="18"/>
               </w:rPr>
-              <w:t>60.0</w:t>
+              <w:t xml:space="preserve">60.0</w:t>
             </w:r>
           </w:p>
         </w:tc>
@@ -3921,7 +3992,7 @@
                 <w:sz w:val="18"/>
                 <w:szCs w:val="18"/>
               </w:rPr>
-              <w:t>3</w:t>
+              <w:t xml:space="preserve">3</w:t>
             </w:r>
           </w:p>
         </w:tc>
@@ -3947,7 +4018,7 @@
                 <w:sz w:val="18"/>
                 <w:szCs w:val="18"/>
               </w:rPr>
-              <w:t>Web Design</w:t>
+              <w:t xml:space="preserve">Web Design</w:t>
             </w:r>
           </w:p>
         </w:tc>
@@ -3973,7 +4044,7 @@
                 <w:sz w:val="18"/>
                 <w:szCs w:val="18"/>
               </w:rPr>
-              <w:t>56.0</w:t>
+              <w:t xml:space="preserve">56.0</w:t>
             </w:r>
           </w:p>
         </w:tc>
@@ -3999,7 +4070,7 @@
                 <w:sz w:val="18"/>
                 <w:szCs w:val="18"/>
               </w:rPr>
-              <w:t>3</w:t>
+              <w:t xml:space="preserve">3</w:t>
             </w:r>
           </w:p>
         </w:tc>
@@ -4030,7 +4101,7 @@
                 <w:sz w:val="18"/>
                 <w:szCs w:val="18"/>
               </w:rPr>
-              <w:t>Computer Networks I</w:t>
+              <w:t xml:space="preserve">Computer Networks I</w:t>
             </w:r>
           </w:p>
         </w:tc>
@@ -4056,7 +4127,7 @@
                 <w:sz w:val="18"/>
                 <w:szCs w:val="18"/>
               </w:rPr>
-              <w:t>63.0</w:t>
+              <w:t xml:space="preserve">63.0</w:t>
             </w:r>
           </w:p>
         </w:tc>
@@ -4082,7 +4153,7 @@
                 <w:sz w:val="18"/>
                 <w:szCs w:val="18"/>
               </w:rPr>
-              <w:t>3</w:t>
+              <w:t xml:space="preserve">3</w:t>
             </w:r>
           </w:p>
         </w:tc>
@@ -4108,7 +4179,7 @@
                 <w:sz w:val="18"/>
                 <w:szCs w:val="18"/>
               </w:rPr>
-              <w:t>Data Structures I</w:t>
+              <w:t xml:space="preserve">Data Structures I</w:t>
             </w:r>
           </w:p>
         </w:tc>
@@ -4134,7 +4205,7 @@
                 <w:sz w:val="18"/>
                 <w:szCs w:val="18"/>
               </w:rPr>
-              <w:t>56.0</w:t>
+              <w:t xml:space="preserve">56.0</w:t>
             </w:r>
           </w:p>
         </w:tc>
@@ -4160,7 +4231,7 @@
                 <w:sz w:val="18"/>
                 <w:szCs w:val="18"/>
               </w:rPr>
-              <w:t>3</w:t>
+              <w:t xml:space="preserve">3</w:t>
             </w:r>
           </w:p>
         </w:tc>
@@ -4191,7 +4262,7 @@
                 <w:sz w:val="18"/>
                 <w:szCs w:val="18"/>
               </w:rPr>
-              <w:t>Software Engineering</w:t>
+              <w:t xml:space="preserve">Software Engineering</w:t>
             </w:r>
           </w:p>
         </w:tc>
@@ -4217,7 +4288,7 @@
                 <w:sz w:val="18"/>
                 <w:szCs w:val="18"/>
               </w:rPr>
-              <w:t>62.0</w:t>
+              <w:t xml:space="preserve">62.0</w:t>
             </w:r>
           </w:p>
         </w:tc>
@@ -4243,7 +4314,7 @@
                 <w:sz w:val="18"/>
                 <w:szCs w:val="18"/>
               </w:rPr>
-              <w:t>3</w:t>
+              <w:t xml:space="preserve">3</w:t>
             </w:r>
           </w:p>
         </w:tc>
@@ -4263,6 +4334,14 @@
                 <w:szCs w:val="18"/>
               </w:rPr>
             </w:pPr>
+            <w:r>
+              <w:rPr>
+                <w:rFonts w:asciiTheme="majorBidi" w:hAnsiTheme="majorBidi" w:cstheme="majorBidi"/>
+                <w:sz w:val="18"/>
+                <w:szCs w:val="18"/>
+              </w:rPr>
+              <w:t xml:space="preserve"/>
+            </w:r>
           </w:p>
         </w:tc>
         <w:tc>
@@ -4281,6 +4360,14 @@
                 <w:szCs w:val="18"/>
               </w:rPr>
             </w:pPr>
+            <w:r>
+              <w:rPr>
+                <w:rFonts w:asciiTheme="majorBidi" w:hAnsiTheme="majorBidi" w:cstheme="majorBidi"/>
+                <w:sz w:val="18"/>
+                <w:szCs w:val="18"/>
+              </w:rPr>
+              <w:t xml:space="preserve"/>
+            </w:r>
           </w:p>
         </w:tc>
         <w:tc>
@@ -4299,6 +4386,14 @@
                 <w:szCs w:val="18"/>
               </w:rPr>
             </w:pPr>
+            <w:r>
+              <w:rPr>
+                <w:rFonts w:asciiTheme="majorBidi" w:hAnsiTheme="majorBidi" w:cstheme="majorBidi"/>
+                <w:sz w:val="18"/>
+                <w:szCs w:val="18"/>
+              </w:rPr>
+              <w:t xml:space="preserve"/>
+            </w:r>
           </w:p>
         </w:tc>
       </w:tr>
@@ -4310,6 +4405,9 @@
         <w:bidi w:val="0"/>
         <w:spacing w:line="240" w:lineRule="auto"/>
       </w:pPr>
+      <w:r>
+        <w:t xml:space="preserve"/>
+      </w:r>
     </w:p>
     <w:tbl>
       <w:tblPr>
@@ -4353,8 +4451,7 @@
                 <w:sz w:val="18"/>
                 <w:szCs w:val="18"/>
               </w:rPr>
-              <w:lastRenderedPageBreak/>
-              <w:t>Semester 7 - 2018-2019</w:t>
+              <w:t xml:space="preserve">Semester 7 - 2018-2019</w:t>
             </w:r>
           </w:p>
         </w:tc>
@@ -4381,7 +4478,7 @@
                 <w:sz w:val="18"/>
                 <w:szCs w:val="18"/>
               </w:rPr>
-              <w:t>Semester 8 - 2018-2019</w:t>
+              <w:t xml:space="preserve">Semester 8 - 2018-2019</w:t>
             </w:r>
           </w:p>
         </w:tc>
@@ -4542,7 +4639,7 @@
                 <w:sz w:val="18"/>
                 <w:szCs w:val="18"/>
               </w:rPr>
-              <w:t>Unit</w:t>
+              <w:t xml:space="preserve">Unit</w:t>
             </w:r>
           </w:p>
         </w:tc>
@@ -4573,7 +4670,7 @@
                 <w:sz w:val="18"/>
                 <w:szCs w:val="18"/>
               </w:rPr>
-              <w:t>E-Business</w:t>
+              <w:t xml:space="preserve">E-Business</w:t>
             </w:r>
           </w:p>
         </w:tc>
@@ -4599,7 +4696,7 @@
                 <w:sz w:val="18"/>
                 <w:szCs w:val="18"/>
               </w:rPr>
-              <w:t>53.0</w:t>
+              <w:t xml:space="preserve">53.0</w:t>
             </w:r>
           </w:p>
         </w:tc>
@@ -4625,7 +4722,7 @@
                 <w:sz w:val="18"/>
                 <w:szCs w:val="18"/>
               </w:rPr>
-              <w:t>2</w:t>
+              <w:t xml:space="preserve">2</w:t>
             </w:r>
           </w:p>
         </w:tc>
@@ -4651,7 +4748,7 @@
                 <w:sz w:val="18"/>
                 <w:szCs w:val="18"/>
               </w:rPr>
-              <w:t>Network Security</w:t>
+              <w:t xml:space="preserve">Network Security</w:t>
             </w:r>
           </w:p>
         </w:tc>
@@ -4677,7 +4774,7 @@
                 <w:sz w:val="18"/>
                 <w:szCs w:val="18"/>
               </w:rPr>
-              <w:t>83.0</w:t>
+              <w:t xml:space="preserve">83.0</w:t>
             </w:r>
           </w:p>
         </w:tc>
@@ -4703,7 +4800,7 @@
                 <w:sz w:val="18"/>
                 <w:szCs w:val="18"/>
               </w:rPr>
-              <w:t>3</w:t>
+              <w:t xml:space="preserve">3</w:t>
             </w:r>
           </w:p>
         </w:tc>
@@ -4734,7 +4831,7 @@
                 <w:sz w:val="18"/>
                 <w:szCs w:val="18"/>
               </w:rPr>
-              <w:t>Data Mining</w:t>
+              <w:t xml:space="preserve">Data Mining</w:t>
             </w:r>
           </w:p>
         </w:tc>
@@ -4760,7 +4857,7 @@
                 <w:sz w:val="18"/>
                 <w:szCs w:val="18"/>
               </w:rPr>
-              <w:t>50.0</w:t>
+              <w:t xml:space="preserve">50.0</w:t>
             </w:r>
           </w:p>
         </w:tc>
@@ -4786,7 +4883,7 @@
                 <w:sz w:val="18"/>
                 <w:szCs w:val="18"/>
               </w:rPr>
-              <w:t>2</w:t>
+              <w:t xml:space="preserve">2</w:t>
             </w:r>
           </w:p>
         </w:tc>
@@ -4812,7 +4909,7 @@
                 <w:sz w:val="18"/>
                 <w:szCs w:val="18"/>
               </w:rPr>
-              <w:t>Data Visualization</w:t>
+              <w:t xml:space="preserve">Data Visualization</w:t>
             </w:r>
           </w:p>
         </w:tc>
@@ -4838,7 +4935,7 @@
                 <w:sz w:val="18"/>
                 <w:szCs w:val="18"/>
               </w:rPr>
-              <w:t>76.0</w:t>
+              <w:t xml:space="preserve">76.0</w:t>
             </w:r>
           </w:p>
         </w:tc>
@@ -4864,7 +4961,7 @@
                 <w:sz w:val="18"/>
                 <w:szCs w:val="18"/>
               </w:rPr>
-              <w:t>3</w:t>
+              <w:t xml:space="preserve">3</w:t>
             </w:r>
           </w:p>
         </w:tc>
@@ -4895,7 +4992,7 @@
                 <w:sz w:val="18"/>
                 <w:szCs w:val="18"/>
               </w:rPr>
-              <w:t>Advanced Web Design</w:t>
+              <w:t xml:space="preserve">Advanced Web Design</w:t>
             </w:r>
           </w:p>
         </w:tc>
@@ -4921,7 +5018,7 @@
                 <w:sz w:val="18"/>
                 <w:szCs w:val="18"/>
               </w:rPr>
-              <w:t>58.0</w:t>
+              <w:t xml:space="preserve">58.0</w:t>
             </w:r>
           </w:p>
         </w:tc>
@@ -4947,7 +5044,7 @@
                 <w:sz w:val="18"/>
                 <w:szCs w:val="18"/>
               </w:rPr>
-              <w:t>3</w:t>
+              <w:t xml:space="preserve">3</w:t>
             </w:r>
           </w:p>
         </w:tc>
@@ -4973,7 +5070,7 @@
                 <w:sz w:val="18"/>
                 <w:szCs w:val="18"/>
               </w:rPr>
-              <w:t>Computational Intelligence</w:t>
+              <w:t xml:space="preserve">Computational Intelligence</w:t>
             </w:r>
           </w:p>
         </w:tc>
@@ -4999,7 +5096,7 @@
                 <w:sz w:val="18"/>
                 <w:szCs w:val="18"/>
               </w:rPr>
-              <w:t>68.0</w:t>
+              <w:t xml:space="preserve">68.0</w:t>
             </w:r>
           </w:p>
         </w:tc>
@@ -5025,7 +5122,7 @@
                 <w:sz w:val="18"/>
                 <w:szCs w:val="18"/>
               </w:rPr>
-              <w:t>3</w:t>
+              <w:t xml:space="preserve">3</w:t>
             </w:r>
           </w:p>
         </w:tc>
@@ -5056,7 +5153,7 @@
                 <w:sz w:val="18"/>
                 <w:szCs w:val="18"/>
               </w:rPr>
-              <w:t>Computer Networks II</w:t>
+              <w:t xml:space="preserve">Computer Networks II</w:t>
             </w:r>
           </w:p>
         </w:tc>
@@ -5082,7 +5179,7 @@
                 <w:sz w:val="18"/>
                 <w:szCs w:val="18"/>
               </w:rPr>
-              <w:t>75.0</w:t>
+              <w:t xml:space="preserve">75.0</w:t>
             </w:r>
           </w:p>
         </w:tc>
@@ -5108,7 +5205,7 @@
                 <w:sz w:val="18"/>
                 <w:szCs w:val="18"/>
               </w:rPr>
-              <w:t>3</w:t>
+              <w:t xml:space="preserve">3</w:t>
             </w:r>
           </w:p>
         </w:tc>
@@ -5134,7 +5231,7 @@
                 <w:sz w:val="18"/>
                 <w:szCs w:val="18"/>
               </w:rPr>
-              <w:t>Senior Project I</w:t>
+              <w:t xml:space="preserve">Senior Project I</w:t>
             </w:r>
           </w:p>
         </w:tc>
@@ -5160,7 +5257,7 @@
                 <w:sz w:val="18"/>
                 <w:szCs w:val="18"/>
               </w:rPr>
-              <w:t>89.0</w:t>
+              <w:t xml:space="preserve">89.0</w:t>
             </w:r>
           </w:p>
         </w:tc>
@@ -5186,7 +5283,7 @@
                 <w:sz w:val="18"/>
                 <w:szCs w:val="18"/>
               </w:rPr>
-              <w:t>2</w:t>
+              <w:t xml:space="preserve">2</w:t>
             </w:r>
           </w:p>
         </w:tc>
@@ -5217,7 +5314,7 @@
                 <w:sz w:val="18"/>
                 <w:szCs w:val="18"/>
               </w:rPr>
-              <w:t>Selected Topics</w:t>
+              <w:t xml:space="preserve">Selected Topics</w:t>
             </w:r>
           </w:p>
         </w:tc>
@@ -5243,7 +5340,7 @@
                 <w:sz w:val="18"/>
                 <w:szCs w:val="18"/>
               </w:rPr>
-              <w:t>55.0</w:t>
+              <w:t xml:space="preserve">55.0</w:t>
             </w:r>
           </w:p>
         </w:tc>
@@ -5269,7 +5366,7 @@
                 <w:sz w:val="18"/>
                 <w:szCs w:val="18"/>
               </w:rPr>
-              <w:t>3</w:t>
+              <w:t xml:space="preserve">3</w:t>
             </w:r>
           </w:p>
         </w:tc>
@@ -5295,7 +5392,7 @@
                 <w:sz w:val="18"/>
                 <w:szCs w:val="18"/>
               </w:rPr>
-              <w:t>Multimedia</w:t>
+              <w:t xml:space="preserve">Multimedia</w:t>
             </w:r>
           </w:p>
         </w:tc>
@@ -5321,7 +5418,7 @@
                 <w:sz w:val="18"/>
                 <w:szCs w:val="18"/>
               </w:rPr>
-              <w:t>68.0</w:t>
+              <w:t xml:space="preserve">68.0</w:t>
             </w:r>
           </w:p>
         </w:tc>
@@ -5347,7 +5444,7 @@
                 <w:sz w:val="18"/>
                 <w:szCs w:val="18"/>
               </w:rPr>
-              <w:t>3</w:t>
+              <w:t xml:space="preserve">3</w:t>
             </w:r>
           </w:p>
         </w:tc>
@@ -5378,7 +5475,7 @@
                 <w:sz w:val="18"/>
                 <w:szCs w:val="18"/>
               </w:rPr>
-              <w:t>Operating Systems</w:t>
+              <w:t xml:space="preserve">Operating Systems</w:t>
             </w:r>
           </w:p>
         </w:tc>
@@ -5404,7 +5501,7 @@
                 <w:sz w:val="18"/>
                 <w:szCs w:val="18"/>
               </w:rPr>
-              <w:t>51.0</w:t>
+              <w:t xml:space="preserve">51.0</w:t>
             </w:r>
           </w:p>
         </w:tc>
@@ -5430,7 +5527,7 @@
                 <w:sz w:val="18"/>
                 <w:szCs w:val="18"/>
               </w:rPr>
-              <w:t>3</w:t>
+              <w:t xml:space="preserve">3</w:t>
             </w:r>
           </w:p>
         </w:tc>
@@ -5456,7 +5553,7 @@
                 <w:sz w:val="18"/>
                 <w:szCs w:val="18"/>
               </w:rPr>
-              <w:t>Games Programming</w:t>
+              <w:t xml:space="preserve">Games Programming</w:t>
             </w:r>
           </w:p>
         </w:tc>
@@ -5482,7 +5579,7 @@
                 <w:sz w:val="18"/>
                 <w:szCs w:val="18"/>
               </w:rPr>
-              <w:t>62.0</w:t>
+              <w:t xml:space="preserve">62.0</w:t>
             </w:r>
           </w:p>
         </w:tc>
@@ -5508,7 +5605,7 @@
                 <w:sz w:val="18"/>
                 <w:szCs w:val="18"/>
               </w:rPr>
-              <w:t>2</w:t>
+              <w:t xml:space="preserve">2</w:t>
             </w:r>
           </w:p>
         </w:tc>
@@ -5533,6 +5630,14 @@
                 <w:szCs w:val="18"/>
               </w:rPr>
             </w:pPr>
+            <w:r>
+              <w:rPr>
+                <w:rFonts w:asciiTheme="majorBidi" w:hAnsiTheme="majorBidi" w:cstheme="majorBidi"/>
+                <w:sz w:val="18"/>
+                <w:szCs w:val="18"/>
+              </w:rPr>
+              <w:t xml:space="preserve"/>
+            </w:r>
           </w:p>
         </w:tc>
         <w:tc>
@@ -5551,6 +5656,14 @@
                 <w:szCs w:val="18"/>
               </w:rPr>
             </w:pPr>
+            <w:r>
+              <w:rPr>
+                <w:rFonts w:asciiTheme="majorBidi" w:hAnsiTheme="majorBidi" w:cstheme="majorBidi"/>
+                <w:sz w:val="18"/>
+                <w:szCs w:val="18"/>
+              </w:rPr>
+              <w:t xml:space="preserve"/>
+            </w:r>
           </w:p>
         </w:tc>
         <w:tc>
@@ -5569,6 +5682,14 @@
                 <w:szCs w:val="18"/>
               </w:rPr>
             </w:pPr>
+            <w:r>
+              <w:rPr>
+                <w:rFonts w:asciiTheme="majorBidi" w:hAnsiTheme="majorBidi" w:cstheme="majorBidi"/>
+                <w:sz w:val="18"/>
+                <w:szCs w:val="18"/>
+              </w:rPr>
+              <w:t xml:space="preserve"/>
+            </w:r>
           </w:p>
         </w:tc>
         <w:tc>
@@ -5593,7 +5714,7 @@
                 <w:sz w:val="18"/>
                 <w:szCs w:val="18"/>
               </w:rPr>
-              <w:t>Distributed Database</w:t>
+              <w:t xml:space="preserve">Distributed Database</w:t>
             </w:r>
           </w:p>
         </w:tc>
@@ -5619,7 +5740,7 @@
                 <w:sz w:val="18"/>
                 <w:szCs w:val="18"/>
               </w:rPr>
-              <w:t>64.0</w:t>
+              <w:t xml:space="preserve">64.0</w:t>
             </w:r>
           </w:p>
         </w:tc>
@@ -5645,7 +5766,7 @@
                 <w:sz w:val="18"/>
                 <w:szCs w:val="18"/>
               </w:rPr>
-              <w:t>3</w:t>
+              <w:t xml:space="preserve">3</w:t>
             </w:r>
           </w:p>
         </w:tc>
@@ -5670,6 +5791,14 @@
                 <w:szCs w:val="18"/>
               </w:rPr>
             </w:pPr>
+            <w:r>
+              <w:rPr>
+                <w:rFonts w:asciiTheme="majorBidi" w:hAnsiTheme="majorBidi" w:cstheme="majorBidi"/>
+                <w:sz w:val="18"/>
+                <w:szCs w:val="18"/>
+              </w:rPr>
+              <w:t xml:space="preserve"/>
+            </w:r>
           </w:p>
         </w:tc>
         <w:tc>
@@ -5688,6 +5817,14 @@
                 <w:szCs w:val="18"/>
               </w:rPr>
             </w:pPr>
+            <w:r>
+              <w:rPr>
+                <w:rFonts w:asciiTheme="majorBidi" w:hAnsiTheme="majorBidi" w:cstheme="majorBidi"/>
+                <w:sz w:val="18"/>
+                <w:szCs w:val="18"/>
+              </w:rPr>
+              <w:t xml:space="preserve"/>
+            </w:r>
           </w:p>
         </w:tc>
         <w:tc>
@@ -5706,6 +5843,14 @@
                 <w:szCs w:val="18"/>
               </w:rPr>
             </w:pPr>
+            <w:r>
+              <w:rPr>
+                <w:rFonts w:asciiTheme="majorBidi" w:hAnsiTheme="majorBidi" w:cstheme="majorBidi"/>
+                <w:sz w:val="18"/>
+                <w:szCs w:val="18"/>
+              </w:rPr>
+              <w:t xml:space="preserve"/>
+            </w:r>
           </w:p>
         </w:tc>
         <w:tc>
@@ -5730,7 +5875,7 @@
                 <w:sz w:val="18"/>
                 <w:szCs w:val="18"/>
               </w:rPr>
-              <w:t>Advanced Operating Systems</w:t>
+              <w:t xml:space="preserve">Advanced Operating Systems</w:t>
             </w:r>
           </w:p>
         </w:tc>
@@ -5756,7 +5901,7 @@
                 <w:sz w:val="18"/>
                 <w:szCs w:val="18"/>
               </w:rPr>
-              <w:t>56.0</w:t>
+              <w:t xml:space="preserve">56.0</w:t>
             </w:r>
           </w:p>
         </w:tc>
@@ -5782,7 +5927,7 @@
                 <w:sz w:val="18"/>
                 <w:szCs w:val="18"/>
               </w:rPr>
-              <w:t>2</w:t>
+              <w:t xml:space="preserve">2</w:t>
             </w:r>
           </w:p>
         </w:tc>
@@ -5795,11 +5940,14 @@
         <w:bidi w:val="0"/>
         <w:spacing w:line="240" w:lineRule="auto"/>
       </w:pPr>
+      <w:r>
+        <w:t xml:space="preserve"/>
+      </w:r>
     </w:p>
     <w:tbl>
       <w:tblPr>
         <w:tblStyle w:val="TableGrid"/>
-        <w:tblW w:w="2505" w:type="pct"/>
+        <w:tblW w:w="5000" w:type="pct"/>
         <w:tblLayout w:type="fixed"/>
         <w:tblLook w:val="04A0" w:firstRow="1" w:lastRow="0" w:firstColumn="1" w:lastColumn="0" w:noHBand="0" w:noVBand="1"/>
       </w:tblPr>
@@ -5807,6 +5955,9 @@
         <w:gridCol w:w="3822"/>
         <w:gridCol w:w="707"/>
         <w:gridCol w:w="709"/>
+        <w:gridCol w:w="3829"/>
+        <w:gridCol w:w="709"/>
+        <w:gridCol w:w="680"/>
       </w:tblGrid>
       <w:tr>
         <w:trPr>
@@ -5814,7 +5965,7 @@
         </w:trPr>
         <w:tc>
           <w:tcPr>
-            <w:tcW w:w="5000" w:type="pct"/>
+            <w:tcW w:w="2505" w:type="pct"/>
             <w:gridSpan w:val="3"/>
           </w:tcPr>
           <w:p>
@@ -5835,7 +5986,34 @@
                 <w:sz w:val="18"/>
                 <w:szCs w:val="18"/>
               </w:rPr>
-              <w:t>Semester 9 - 2019-2020</w:t>
+              <w:t xml:space="preserve">Semester 9 - 2019-2020</w:t>
+            </w:r>
+          </w:p>
+        </w:tc>
+        <w:tc>
+          <w:tcPr>
+            <w:tcW w:w="2495" w:type="pct"/>
+            <w:gridSpan w:val="3"/>
+          </w:tcPr>
+          <w:p>
+            <w:pPr>
+              <w:keepNext/>
+              <w:keepLines/>
+              <w:bidi w:val="0"/>
+              <w:spacing w:after="0"/>
+              <w:rPr>
+                <w:rFonts w:asciiTheme="majorBidi" w:hAnsiTheme="majorBidi" w:cstheme="majorBidi"/>
+                <w:sz w:val="18"/>
+                <w:szCs w:val="18"/>
+              </w:rPr>
+            </w:pPr>
+            <w:r>
+              <w:rPr>
+                <w:rFonts w:asciiTheme="majorBidi" w:hAnsiTheme="majorBidi" w:cstheme="majorBidi"/>
+                <w:sz w:val="18"/>
+                <w:szCs w:val="18"/>
+              </w:rPr>
+              <w:t xml:space="preserve"/>
             </w:r>
           </w:p>
         </w:tc>
@@ -5846,7 +6024,7 @@
         </w:trPr>
         <w:tc>
           <w:tcPr>
-            <w:tcW w:w="3648" w:type="pct"/>
+            <w:tcW w:w="1828" w:type="pct"/>
           </w:tcPr>
           <w:p>
             <w:pPr>
@@ -5872,7 +6050,7 @@
         </w:tc>
         <w:tc>
           <w:tcPr>
-            <w:tcW w:w="675" w:type="pct"/>
+            <w:tcW w:w="338" w:type="pct"/>
           </w:tcPr>
           <w:p>
             <w:pPr>
@@ -5898,7 +6076,7 @@
         </w:tc>
         <w:tc>
           <w:tcPr>
-            <w:tcW w:w="677" w:type="pct"/>
+            <w:tcW w:w="339" w:type="pct"/>
           </w:tcPr>
           <w:p>
             <w:pPr>
@@ -5919,6 +6097,84 @@
                 <w:szCs w:val="18"/>
               </w:rPr>
               <w:t>Unit</w:t>
+            </w:r>
+          </w:p>
+        </w:tc>
+        <w:tc>
+          <w:tcPr>
+            <w:tcW w:w="1831" w:type="pct"/>
+          </w:tcPr>
+          <w:p>
+            <w:pPr>
+              <w:keepNext/>
+              <w:keepLines/>
+              <w:bidi w:val="0"/>
+              <w:spacing w:after="0"/>
+              <w:rPr>
+                <w:rFonts w:asciiTheme="majorBidi" w:hAnsiTheme="majorBidi" w:cstheme="majorBidi"/>
+                <w:sz w:val="18"/>
+                <w:szCs w:val="18"/>
+              </w:rPr>
+            </w:pPr>
+            <w:r>
+              <w:rPr>
+                <w:rFonts w:asciiTheme="majorBidi" w:hAnsiTheme="majorBidi" w:cstheme="majorBidi"/>
+                <w:sz w:val="18"/>
+                <w:szCs w:val="18"/>
+              </w:rPr>
+              <w:t>Subject</w:t>
+            </w:r>
+          </w:p>
+        </w:tc>
+        <w:tc>
+          <w:tcPr>
+            <w:tcW w:w="339" w:type="pct"/>
+          </w:tcPr>
+          <w:p>
+            <w:pPr>
+              <w:keepNext/>
+              <w:keepLines/>
+              <w:bidi w:val="0"/>
+              <w:spacing w:after="0"/>
+              <w:rPr>
+                <w:rFonts w:asciiTheme="majorBidi" w:hAnsiTheme="majorBidi" w:cstheme="majorBidi"/>
+                <w:sz w:val="18"/>
+                <w:szCs w:val="18"/>
+              </w:rPr>
+            </w:pPr>
+            <w:r>
+              <w:rPr>
+                <w:rFonts w:asciiTheme="majorBidi" w:hAnsiTheme="majorBidi" w:cstheme="majorBidi"/>
+                <w:sz w:val="18"/>
+                <w:szCs w:val="18"/>
+              </w:rPr>
+              <w:t>Mark</w:t>
+            </w:r>
+          </w:p>
+        </w:tc>
+        <w:tc>
+          <w:tcPr>
+            <w:tcW w:w="325" w:type="pct"/>
+          </w:tcPr>
+          <w:p>
+            <w:pPr>
+              <w:keepNext/>
+              <w:keepLines/>
+              <w:bidi w:val="0"/>
+              <w:spacing w:after="0"/>
+              <w:rPr>
+                <w:rFonts w:asciiTheme="majorBidi" w:hAnsiTheme="majorBidi" w:cstheme="majorBidi"/>
+                <w:sz w:val="18"/>
+                <w:szCs w:val="18"/>
+              </w:rPr>
+            </w:pPr>
+            <w:r>
+              <w:rPr>
+                <w:rFonts w:asciiTheme="majorBidi" w:hAnsiTheme="majorBidi" w:cstheme="majorBidi"/>
+                <w:sz w:val="18"/>
+                <w:szCs w:val="18"/>
+              </w:rPr>
+              <w:t xml:space="preserve">Unit</w:t>
             </w:r>
           </w:p>
         </w:tc>
@@ -5929,79 +6185,157 @@
         </w:trPr>
         <w:tc>
           <w:tcPr>
-            <w:tcW w:w="3648" w:type="pct"/>
-          </w:tcPr>
-          <w:p>
-            <w:pPr>
-              <w:keepNext/>
-              <w:keepLines/>
-              <w:bidi w:val="0"/>
-              <w:spacing w:after="0"/>
-              <w:rPr>
-                <w:rFonts w:asciiTheme="majorBidi" w:hAnsiTheme="majorBidi" w:cstheme="majorBidi"/>
-                <w:sz w:val="18"/>
-                <w:szCs w:val="18"/>
-              </w:rPr>
-            </w:pPr>
-            <w:r>
-              <w:rPr>
-                <w:rFonts w:asciiTheme="majorBidi" w:hAnsiTheme="majorBidi" w:cstheme="majorBidi"/>
-                <w:sz w:val="18"/>
-                <w:szCs w:val="18"/>
-              </w:rPr>
-              <w:t>Cloud Computing</w:t>
-            </w:r>
-          </w:p>
-        </w:tc>
-        <w:tc>
-          <w:tcPr>
-            <w:tcW w:w="675" w:type="pct"/>
-          </w:tcPr>
-          <w:p>
-            <w:pPr>
-              <w:keepNext/>
-              <w:keepLines/>
-              <w:bidi w:val="0"/>
-              <w:spacing w:after="0"/>
-              <w:rPr>
-                <w:rFonts w:asciiTheme="majorBidi" w:hAnsiTheme="majorBidi" w:cstheme="majorBidi"/>
-                <w:sz w:val="18"/>
-                <w:szCs w:val="18"/>
-              </w:rPr>
-            </w:pPr>
-            <w:r>
-              <w:rPr>
-                <w:rFonts w:asciiTheme="majorBidi" w:hAnsiTheme="majorBidi" w:cstheme="majorBidi"/>
-                <w:sz w:val="18"/>
-                <w:szCs w:val="18"/>
-              </w:rPr>
-              <w:t>78.0</w:t>
-            </w:r>
-          </w:p>
-        </w:tc>
-        <w:tc>
-          <w:tcPr>
-            <w:tcW w:w="677" w:type="pct"/>
-          </w:tcPr>
-          <w:p>
-            <w:pPr>
-              <w:keepNext/>
-              <w:keepLines/>
-              <w:bidi w:val="0"/>
-              <w:spacing w:after="0"/>
-              <w:rPr>
-                <w:rFonts w:asciiTheme="majorBidi" w:hAnsiTheme="majorBidi" w:cstheme="majorBidi"/>
-                <w:sz w:val="18"/>
-                <w:szCs w:val="18"/>
-              </w:rPr>
-            </w:pPr>
-            <w:r>
-              <w:rPr>
-                <w:rFonts w:asciiTheme="majorBidi" w:hAnsiTheme="majorBidi" w:cstheme="majorBidi"/>
-                <w:sz w:val="18"/>
-                <w:szCs w:val="18"/>
-              </w:rPr>
-              <w:t>2</w:t>
+            <w:tcW w:w="1828" w:type="pct"/>
+          </w:tcPr>
+          <w:p>
+            <w:pPr>
+              <w:keepNext/>
+              <w:keepLines/>
+              <w:bidi w:val="0"/>
+              <w:spacing w:after="0"/>
+              <w:rPr>
+                <w:rFonts w:asciiTheme="majorBidi" w:hAnsiTheme="majorBidi" w:cstheme="majorBidi"/>
+                <w:sz w:val="18"/>
+                <w:szCs w:val="18"/>
+              </w:rPr>
+            </w:pPr>
+            <w:r>
+              <w:rPr>
+                <w:rFonts w:asciiTheme="majorBidi" w:hAnsiTheme="majorBidi" w:cstheme="majorBidi"/>
+                <w:sz w:val="18"/>
+                <w:szCs w:val="18"/>
+              </w:rPr>
+              <w:t xml:space="preserve">Cloud Computing</w:t>
+            </w:r>
+          </w:p>
+        </w:tc>
+        <w:tc>
+          <w:tcPr>
+            <w:tcW w:w="338" w:type="pct"/>
+          </w:tcPr>
+          <w:p>
+            <w:pPr>
+              <w:keepNext/>
+              <w:keepLines/>
+              <w:bidi w:val="0"/>
+              <w:spacing w:after="0"/>
+              <w:rPr>
+                <w:rFonts w:asciiTheme="majorBidi" w:hAnsiTheme="majorBidi" w:cstheme="majorBidi"/>
+                <w:sz w:val="18"/>
+                <w:szCs w:val="18"/>
+              </w:rPr>
+            </w:pPr>
+            <w:r>
+              <w:rPr>
+                <w:rFonts w:asciiTheme="majorBidi" w:hAnsiTheme="majorBidi" w:cstheme="majorBidi"/>
+                <w:sz w:val="18"/>
+                <w:szCs w:val="18"/>
+              </w:rPr>
+              <w:t xml:space="preserve">78.0</w:t>
+            </w:r>
+          </w:p>
+        </w:tc>
+        <w:tc>
+          <w:tcPr>
+            <w:tcW w:w="339" w:type="pct"/>
+          </w:tcPr>
+          <w:p>
+            <w:pPr>
+              <w:keepNext/>
+              <w:keepLines/>
+              <w:bidi w:val="0"/>
+              <w:spacing w:after="0"/>
+              <w:rPr>
+                <w:rFonts w:asciiTheme="majorBidi" w:hAnsiTheme="majorBidi" w:cstheme="majorBidi"/>
+                <w:sz w:val="18"/>
+                <w:szCs w:val="18"/>
+              </w:rPr>
+            </w:pPr>
+            <w:r>
+              <w:rPr>
+                <w:rFonts w:asciiTheme="majorBidi" w:hAnsiTheme="majorBidi" w:cstheme="majorBidi"/>
+                <w:sz w:val="18"/>
+                <w:szCs w:val="18"/>
+              </w:rPr>
+              <w:t xml:space="preserve">2</w:t>
+            </w:r>
+          </w:p>
+        </w:tc>
+        <w:tc>
+          <w:tcPr>
+            <w:tcW w:w="1831" w:type="pct"/>
+          </w:tcPr>
+          <w:p>
+            <w:pPr>
+              <w:keepNext/>
+              <w:keepLines/>
+              <w:bidi w:val="0"/>
+              <w:spacing w:after="0"/>
+              <w:rPr>
+                <w:rFonts w:asciiTheme="majorBidi" w:hAnsiTheme="majorBidi" w:cstheme="majorBidi"/>
+                <w:sz w:val="18"/>
+                <w:szCs w:val="18"/>
+              </w:rPr>
+            </w:pPr>
+            <w:r>
+              <w:rPr>
+                <w:rFonts w:asciiTheme="majorBidi" w:hAnsiTheme="majorBidi" w:cstheme="majorBidi"/>
+                <w:sz w:val="18"/>
+                <w:szCs w:val="18"/>
+              </w:rPr>
+              <w:t xml:space="preserve"/>
+            </w:r>
+          </w:p>
+        </w:tc>
+        <w:tc>
+          <w:tcPr>
+            <w:tcW w:w="339" w:type="pct"/>
+          </w:tcPr>
+          <w:p>
+            <w:pPr>
+              <w:keepNext/>
+              <w:keepLines/>
+              <w:bidi w:val="0"/>
+              <w:spacing w:after="0"/>
+              <w:rPr>
+                <w:rFonts w:asciiTheme="majorBidi" w:hAnsiTheme="majorBidi" w:cstheme="majorBidi"/>
+                <w:sz w:val="18"/>
+                <w:szCs w:val="18"/>
+              </w:rPr>
+            </w:pPr>
+            <w:r>
+              <w:rPr>
+                <w:rFonts w:asciiTheme="majorBidi" w:hAnsiTheme="majorBidi" w:cstheme="majorBidi"/>
+                <w:sz w:val="18"/>
+                <w:szCs w:val="18"/>
+              </w:rPr>
+              <w:t xml:space="preserve"/>
+            </w:r>
+          </w:p>
+        </w:tc>
+        <w:tc>
+          <w:tcPr>
+            <w:tcW w:w="325" w:type="pct"/>
+          </w:tcPr>
+          <w:p>
+            <w:pPr>
+              <w:keepNext/>
+              <w:keepLines/>
+              <w:bidi w:val="0"/>
+              <w:spacing w:after="0"/>
+              <w:rPr>
+                <w:rFonts w:asciiTheme="majorBidi" w:hAnsiTheme="majorBidi" w:cstheme="majorBidi"/>
+                <w:sz w:val="18"/>
+                <w:szCs w:val="18"/>
+              </w:rPr>
+            </w:pPr>
+            <w:r>
+              <w:rPr>
+                <w:rFonts w:asciiTheme="majorBidi" w:hAnsiTheme="majorBidi" w:cstheme="majorBidi"/>
+                <w:sz w:val="18"/>
+                <w:szCs w:val="18"/>
+              </w:rPr>
+              <w:t xml:space="preserve"/>
             </w:r>
           </w:p>
         </w:tc>
@@ -6012,79 +6346,157 @@
         </w:trPr>
         <w:tc>
           <w:tcPr>
-            <w:tcW w:w="3648" w:type="pct"/>
-          </w:tcPr>
-          <w:p>
-            <w:pPr>
-              <w:keepNext/>
-              <w:keepLines/>
-              <w:bidi w:val="0"/>
-              <w:spacing w:after="0"/>
-              <w:rPr>
-                <w:rFonts w:asciiTheme="majorBidi" w:hAnsiTheme="majorBidi" w:cstheme="majorBidi"/>
-                <w:sz w:val="18"/>
-                <w:szCs w:val="18"/>
-              </w:rPr>
-            </w:pPr>
-            <w:r>
-              <w:rPr>
-                <w:rFonts w:asciiTheme="majorBidi" w:hAnsiTheme="majorBidi" w:cstheme="majorBidi"/>
-                <w:sz w:val="18"/>
-                <w:szCs w:val="18"/>
-              </w:rPr>
-              <w:t>Mobile Applications</w:t>
-            </w:r>
-          </w:p>
-        </w:tc>
-        <w:tc>
-          <w:tcPr>
-            <w:tcW w:w="675" w:type="pct"/>
-          </w:tcPr>
-          <w:p>
-            <w:pPr>
-              <w:keepNext/>
-              <w:keepLines/>
-              <w:bidi w:val="0"/>
-              <w:spacing w:after="0"/>
-              <w:rPr>
-                <w:rFonts w:asciiTheme="majorBidi" w:hAnsiTheme="majorBidi" w:cstheme="majorBidi"/>
-                <w:sz w:val="18"/>
-                <w:szCs w:val="18"/>
-              </w:rPr>
-            </w:pPr>
-            <w:r>
-              <w:rPr>
-                <w:rFonts w:asciiTheme="majorBidi" w:hAnsiTheme="majorBidi" w:cstheme="majorBidi"/>
-                <w:sz w:val="18"/>
-                <w:szCs w:val="18"/>
-              </w:rPr>
-              <w:t>98.0</w:t>
-            </w:r>
-          </w:p>
-        </w:tc>
-        <w:tc>
-          <w:tcPr>
-            <w:tcW w:w="677" w:type="pct"/>
-          </w:tcPr>
-          <w:p>
-            <w:pPr>
-              <w:keepNext/>
-              <w:keepLines/>
-              <w:bidi w:val="0"/>
-              <w:spacing w:after="0"/>
-              <w:rPr>
-                <w:rFonts w:asciiTheme="majorBidi" w:hAnsiTheme="majorBidi" w:cstheme="majorBidi"/>
-                <w:sz w:val="18"/>
-                <w:szCs w:val="18"/>
-              </w:rPr>
-            </w:pPr>
-            <w:r>
-              <w:rPr>
-                <w:rFonts w:asciiTheme="majorBidi" w:hAnsiTheme="majorBidi" w:cstheme="majorBidi"/>
-                <w:sz w:val="18"/>
-                <w:szCs w:val="18"/>
-              </w:rPr>
-              <w:t>3</w:t>
+            <w:tcW w:w="1828" w:type="pct"/>
+          </w:tcPr>
+          <w:p>
+            <w:pPr>
+              <w:keepNext/>
+              <w:keepLines/>
+              <w:bidi w:val="0"/>
+              <w:spacing w:after="0"/>
+              <w:rPr>
+                <w:rFonts w:asciiTheme="majorBidi" w:hAnsiTheme="majorBidi" w:cstheme="majorBidi"/>
+                <w:sz w:val="18"/>
+                <w:szCs w:val="18"/>
+              </w:rPr>
+            </w:pPr>
+            <w:r>
+              <w:rPr>
+                <w:rFonts w:asciiTheme="majorBidi" w:hAnsiTheme="majorBidi" w:cstheme="majorBidi"/>
+                <w:sz w:val="18"/>
+                <w:szCs w:val="18"/>
+              </w:rPr>
+              <w:t xml:space="preserve">Mobile Applications</w:t>
+            </w:r>
+          </w:p>
+        </w:tc>
+        <w:tc>
+          <w:tcPr>
+            <w:tcW w:w="338" w:type="pct"/>
+          </w:tcPr>
+          <w:p>
+            <w:pPr>
+              <w:keepNext/>
+              <w:keepLines/>
+              <w:bidi w:val="0"/>
+              <w:spacing w:after="0"/>
+              <w:rPr>
+                <w:rFonts w:asciiTheme="majorBidi" w:hAnsiTheme="majorBidi" w:cstheme="majorBidi"/>
+                <w:sz w:val="18"/>
+                <w:szCs w:val="18"/>
+              </w:rPr>
+            </w:pPr>
+            <w:r>
+              <w:rPr>
+                <w:rFonts w:asciiTheme="majorBidi" w:hAnsiTheme="majorBidi" w:cstheme="majorBidi"/>
+                <w:sz w:val="18"/>
+                <w:szCs w:val="18"/>
+              </w:rPr>
+              <w:t xml:space="preserve">98.0</w:t>
+            </w:r>
+          </w:p>
+        </w:tc>
+        <w:tc>
+          <w:tcPr>
+            <w:tcW w:w="339" w:type="pct"/>
+          </w:tcPr>
+          <w:p>
+            <w:pPr>
+              <w:keepNext/>
+              <w:keepLines/>
+              <w:bidi w:val="0"/>
+              <w:spacing w:after="0"/>
+              <w:rPr>
+                <w:rFonts w:asciiTheme="majorBidi" w:hAnsiTheme="majorBidi" w:cstheme="majorBidi"/>
+                <w:sz w:val="18"/>
+                <w:szCs w:val="18"/>
+              </w:rPr>
+            </w:pPr>
+            <w:r>
+              <w:rPr>
+                <w:rFonts w:asciiTheme="majorBidi" w:hAnsiTheme="majorBidi" w:cstheme="majorBidi"/>
+                <w:sz w:val="18"/>
+                <w:szCs w:val="18"/>
+              </w:rPr>
+              <w:t xml:space="preserve">3</w:t>
+            </w:r>
+          </w:p>
+        </w:tc>
+        <w:tc>
+          <w:tcPr>
+            <w:tcW w:w="1831" w:type="pct"/>
+          </w:tcPr>
+          <w:p>
+            <w:pPr>
+              <w:keepNext/>
+              <w:keepLines/>
+              <w:bidi w:val="0"/>
+              <w:spacing w:after="0"/>
+              <w:rPr>
+                <w:rFonts w:asciiTheme="majorBidi" w:hAnsiTheme="majorBidi" w:cstheme="majorBidi"/>
+                <w:sz w:val="18"/>
+                <w:szCs w:val="18"/>
+              </w:rPr>
+            </w:pPr>
+            <w:r>
+              <w:rPr>
+                <w:rFonts w:asciiTheme="majorBidi" w:hAnsiTheme="majorBidi" w:cstheme="majorBidi"/>
+                <w:sz w:val="18"/>
+                <w:szCs w:val="18"/>
+              </w:rPr>
+              <w:t xml:space="preserve"/>
+            </w:r>
+          </w:p>
+        </w:tc>
+        <w:tc>
+          <w:tcPr>
+            <w:tcW w:w="339" w:type="pct"/>
+          </w:tcPr>
+          <w:p>
+            <w:pPr>
+              <w:keepNext/>
+              <w:keepLines/>
+              <w:bidi w:val="0"/>
+              <w:spacing w:after="0"/>
+              <w:rPr>
+                <w:rFonts w:asciiTheme="majorBidi" w:hAnsiTheme="majorBidi" w:cstheme="majorBidi"/>
+                <w:sz w:val="18"/>
+                <w:szCs w:val="18"/>
+              </w:rPr>
+            </w:pPr>
+            <w:r>
+              <w:rPr>
+                <w:rFonts w:asciiTheme="majorBidi" w:hAnsiTheme="majorBidi" w:cstheme="majorBidi"/>
+                <w:sz w:val="18"/>
+                <w:szCs w:val="18"/>
+              </w:rPr>
+              <w:t xml:space="preserve"/>
+            </w:r>
+          </w:p>
+        </w:tc>
+        <w:tc>
+          <w:tcPr>
+            <w:tcW w:w="325" w:type="pct"/>
+          </w:tcPr>
+          <w:p>
+            <w:pPr>
+              <w:keepNext/>
+              <w:keepLines/>
+              <w:bidi w:val="0"/>
+              <w:spacing w:after="0"/>
+              <w:rPr>
+                <w:rFonts w:asciiTheme="majorBidi" w:hAnsiTheme="majorBidi" w:cstheme="majorBidi"/>
+                <w:sz w:val="18"/>
+                <w:szCs w:val="18"/>
+              </w:rPr>
+            </w:pPr>
+            <w:r>
+              <w:rPr>
+                <w:rFonts w:asciiTheme="majorBidi" w:hAnsiTheme="majorBidi" w:cstheme="majorBidi"/>
+                <w:sz w:val="18"/>
+                <w:szCs w:val="18"/>
+              </w:rPr>
+              <w:t xml:space="preserve"/>
             </w:r>
           </w:p>
         </w:tc>
@@ -6095,79 +6507,157 @@
         </w:trPr>
         <w:tc>
           <w:tcPr>
-            <w:tcW w:w="3648" w:type="pct"/>
-          </w:tcPr>
-          <w:p>
-            <w:pPr>
-              <w:keepNext/>
-              <w:keepLines/>
-              <w:bidi w:val="0"/>
-              <w:spacing w:after="0"/>
-              <w:rPr>
-                <w:rFonts w:asciiTheme="majorBidi" w:hAnsiTheme="majorBidi" w:cstheme="majorBidi"/>
-                <w:sz w:val="18"/>
-                <w:szCs w:val="18"/>
-              </w:rPr>
-            </w:pPr>
-            <w:r>
-              <w:rPr>
-                <w:rFonts w:asciiTheme="majorBidi" w:hAnsiTheme="majorBidi" w:cstheme="majorBidi"/>
-                <w:sz w:val="18"/>
-                <w:szCs w:val="18"/>
-              </w:rPr>
-              <w:t>Communication Skills</w:t>
-            </w:r>
-          </w:p>
-        </w:tc>
-        <w:tc>
-          <w:tcPr>
-            <w:tcW w:w="675" w:type="pct"/>
-          </w:tcPr>
-          <w:p>
-            <w:pPr>
-              <w:keepNext/>
-              <w:keepLines/>
-              <w:bidi w:val="0"/>
-              <w:spacing w:after="0"/>
-              <w:rPr>
-                <w:rFonts w:asciiTheme="majorBidi" w:hAnsiTheme="majorBidi" w:cstheme="majorBidi"/>
-                <w:sz w:val="18"/>
-                <w:szCs w:val="18"/>
-              </w:rPr>
-            </w:pPr>
-            <w:r>
-              <w:rPr>
-                <w:rFonts w:asciiTheme="majorBidi" w:hAnsiTheme="majorBidi" w:cstheme="majorBidi"/>
-                <w:sz w:val="18"/>
-                <w:szCs w:val="18"/>
-              </w:rPr>
-              <w:t>87.0</w:t>
-            </w:r>
-          </w:p>
-        </w:tc>
-        <w:tc>
-          <w:tcPr>
-            <w:tcW w:w="677" w:type="pct"/>
-          </w:tcPr>
-          <w:p>
-            <w:pPr>
-              <w:keepNext/>
-              <w:keepLines/>
-              <w:bidi w:val="0"/>
-              <w:spacing w:after="0"/>
-              <w:rPr>
-                <w:rFonts w:asciiTheme="majorBidi" w:hAnsiTheme="majorBidi" w:cstheme="majorBidi"/>
-                <w:sz w:val="18"/>
-                <w:szCs w:val="18"/>
-              </w:rPr>
-            </w:pPr>
-            <w:r>
-              <w:rPr>
-                <w:rFonts w:asciiTheme="majorBidi" w:hAnsiTheme="majorBidi" w:cstheme="majorBidi"/>
-                <w:sz w:val="18"/>
-                <w:szCs w:val="18"/>
-              </w:rPr>
-              <w:t>2</w:t>
+            <w:tcW w:w="1828" w:type="pct"/>
+          </w:tcPr>
+          <w:p>
+            <w:pPr>
+              <w:keepNext/>
+              <w:keepLines/>
+              <w:bidi w:val="0"/>
+              <w:spacing w:after="0"/>
+              <w:rPr>
+                <w:rFonts w:asciiTheme="majorBidi" w:hAnsiTheme="majorBidi" w:cstheme="majorBidi"/>
+                <w:sz w:val="18"/>
+                <w:szCs w:val="18"/>
+              </w:rPr>
+            </w:pPr>
+            <w:r>
+              <w:rPr>
+                <w:rFonts w:asciiTheme="majorBidi" w:hAnsiTheme="majorBidi" w:cstheme="majorBidi"/>
+                <w:sz w:val="18"/>
+                <w:szCs w:val="18"/>
+              </w:rPr>
+              <w:t xml:space="preserve">Communication Skills</w:t>
+            </w:r>
+          </w:p>
+        </w:tc>
+        <w:tc>
+          <w:tcPr>
+            <w:tcW w:w="338" w:type="pct"/>
+          </w:tcPr>
+          <w:p>
+            <w:pPr>
+              <w:keepNext/>
+              <w:keepLines/>
+              <w:bidi w:val="0"/>
+              <w:spacing w:after="0"/>
+              <w:rPr>
+                <w:rFonts w:asciiTheme="majorBidi" w:hAnsiTheme="majorBidi" w:cstheme="majorBidi"/>
+                <w:sz w:val="18"/>
+                <w:szCs w:val="18"/>
+              </w:rPr>
+            </w:pPr>
+            <w:r>
+              <w:rPr>
+                <w:rFonts w:asciiTheme="majorBidi" w:hAnsiTheme="majorBidi" w:cstheme="majorBidi"/>
+                <w:sz w:val="18"/>
+                <w:szCs w:val="18"/>
+              </w:rPr>
+              <w:t xml:space="preserve">87.0</w:t>
+            </w:r>
+          </w:p>
+        </w:tc>
+        <w:tc>
+          <w:tcPr>
+            <w:tcW w:w="339" w:type="pct"/>
+          </w:tcPr>
+          <w:p>
+            <w:pPr>
+              <w:keepNext/>
+              <w:keepLines/>
+              <w:bidi w:val="0"/>
+              <w:spacing w:after="0"/>
+              <w:rPr>
+                <w:rFonts w:asciiTheme="majorBidi" w:hAnsiTheme="majorBidi" w:cstheme="majorBidi"/>
+                <w:sz w:val="18"/>
+                <w:szCs w:val="18"/>
+              </w:rPr>
+            </w:pPr>
+            <w:r>
+              <w:rPr>
+                <w:rFonts w:asciiTheme="majorBidi" w:hAnsiTheme="majorBidi" w:cstheme="majorBidi"/>
+                <w:sz w:val="18"/>
+                <w:szCs w:val="18"/>
+              </w:rPr>
+              <w:t xml:space="preserve">2</w:t>
+            </w:r>
+          </w:p>
+        </w:tc>
+        <w:tc>
+          <w:tcPr>
+            <w:tcW w:w="1831" w:type="pct"/>
+          </w:tcPr>
+          <w:p>
+            <w:pPr>
+              <w:keepNext/>
+              <w:keepLines/>
+              <w:bidi w:val="0"/>
+              <w:spacing w:after="0"/>
+              <w:rPr>
+                <w:rFonts w:asciiTheme="majorBidi" w:hAnsiTheme="majorBidi" w:cstheme="majorBidi"/>
+                <w:sz w:val="18"/>
+                <w:szCs w:val="18"/>
+              </w:rPr>
+            </w:pPr>
+            <w:r>
+              <w:rPr>
+                <w:rFonts w:asciiTheme="majorBidi" w:hAnsiTheme="majorBidi" w:cstheme="majorBidi"/>
+                <w:sz w:val="18"/>
+                <w:szCs w:val="18"/>
+              </w:rPr>
+              <w:t xml:space="preserve"/>
+            </w:r>
+          </w:p>
+        </w:tc>
+        <w:tc>
+          <w:tcPr>
+            <w:tcW w:w="339" w:type="pct"/>
+          </w:tcPr>
+          <w:p>
+            <w:pPr>
+              <w:keepNext/>
+              <w:keepLines/>
+              <w:bidi w:val="0"/>
+              <w:spacing w:after="0"/>
+              <w:rPr>
+                <w:rFonts w:asciiTheme="majorBidi" w:hAnsiTheme="majorBidi" w:cstheme="majorBidi"/>
+                <w:sz w:val="18"/>
+                <w:szCs w:val="18"/>
+              </w:rPr>
+            </w:pPr>
+            <w:r>
+              <w:rPr>
+                <w:rFonts w:asciiTheme="majorBidi" w:hAnsiTheme="majorBidi" w:cstheme="majorBidi"/>
+                <w:sz w:val="18"/>
+                <w:szCs w:val="18"/>
+              </w:rPr>
+              <w:t xml:space="preserve"/>
+            </w:r>
+          </w:p>
+        </w:tc>
+        <w:tc>
+          <w:tcPr>
+            <w:tcW w:w="325" w:type="pct"/>
+          </w:tcPr>
+          <w:p>
+            <w:pPr>
+              <w:keepNext/>
+              <w:keepLines/>
+              <w:bidi w:val="0"/>
+              <w:spacing w:after="0"/>
+              <w:rPr>
+                <w:rFonts w:asciiTheme="majorBidi" w:hAnsiTheme="majorBidi" w:cstheme="majorBidi"/>
+                <w:sz w:val="18"/>
+                <w:szCs w:val="18"/>
+              </w:rPr>
+            </w:pPr>
+            <w:r>
+              <w:rPr>
+                <w:rFonts w:asciiTheme="majorBidi" w:hAnsiTheme="majorBidi" w:cstheme="majorBidi"/>
+                <w:sz w:val="18"/>
+                <w:szCs w:val="18"/>
+              </w:rPr>
+              <w:t xml:space="preserve"/>
             </w:r>
           </w:p>
         </w:tc>
@@ -6178,79 +6668,157 @@
         </w:trPr>
         <w:tc>
           <w:tcPr>
-            <w:tcW w:w="3648" w:type="pct"/>
-          </w:tcPr>
-          <w:p>
-            <w:pPr>
-              <w:keepNext/>
-              <w:keepLines/>
-              <w:bidi w:val="0"/>
-              <w:spacing w:after="0"/>
-              <w:rPr>
-                <w:rFonts w:asciiTheme="majorBidi" w:hAnsiTheme="majorBidi" w:cstheme="majorBidi"/>
-                <w:sz w:val="18"/>
-                <w:szCs w:val="18"/>
-              </w:rPr>
-            </w:pPr>
-            <w:r>
-              <w:rPr>
-                <w:rFonts w:asciiTheme="majorBidi" w:hAnsiTheme="majorBidi" w:cstheme="majorBidi"/>
-                <w:sz w:val="18"/>
-                <w:szCs w:val="18"/>
-              </w:rPr>
-              <w:t>Information Theory</w:t>
-            </w:r>
-          </w:p>
-        </w:tc>
-        <w:tc>
-          <w:tcPr>
-            <w:tcW w:w="675" w:type="pct"/>
-          </w:tcPr>
-          <w:p>
-            <w:pPr>
-              <w:keepNext/>
-              <w:keepLines/>
-              <w:bidi w:val="0"/>
-              <w:spacing w:after="0"/>
-              <w:rPr>
-                <w:rFonts w:asciiTheme="majorBidi" w:hAnsiTheme="majorBidi" w:cstheme="majorBidi"/>
-                <w:sz w:val="18"/>
-                <w:szCs w:val="18"/>
-              </w:rPr>
-            </w:pPr>
-            <w:r>
-              <w:rPr>
-                <w:rFonts w:asciiTheme="majorBidi" w:hAnsiTheme="majorBidi" w:cstheme="majorBidi"/>
-                <w:sz w:val="18"/>
-                <w:szCs w:val="18"/>
-              </w:rPr>
-              <w:t>77.0</w:t>
-            </w:r>
-          </w:p>
-        </w:tc>
-        <w:tc>
-          <w:tcPr>
-            <w:tcW w:w="677" w:type="pct"/>
-          </w:tcPr>
-          <w:p>
-            <w:pPr>
-              <w:keepNext/>
-              <w:keepLines/>
-              <w:bidi w:val="0"/>
-              <w:spacing w:after="0"/>
-              <w:rPr>
-                <w:rFonts w:asciiTheme="majorBidi" w:hAnsiTheme="majorBidi" w:cstheme="majorBidi"/>
-                <w:sz w:val="18"/>
-                <w:szCs w:val="18"/>
-              </w:rPr>
-            </w:pPr>
-            <w:r>
-              <w:rPr>
-                <w:rFonts w:asciiTheme="majorBidi" w:hAnsiTheme="majorBidi" w:cstheme="majorBidi"/>
-                <w:sz w:val="18"/>
-                <w:szCs w:val="18"/>
-              </w:rPr>
-              <w:t>3</w:t>
+            <w:tcW w:w="1828" w:type="pct"/>
+          </w:tcPr>
+          <w:p>
+            <w:pPr>
+              <w:keepNext/>
+              <w:keepLines/>
+              <w:bidi w:val="0"/>
+              <w:spacing w:after="0"/>
+              <w:rPr>
+                <w:rFonts w:asciiTheme="majorBidi" w:hAnsiTheme="majorBidi" w:cstheme="majorBidi"/>
+                <w:sz w:val="18"/>
+                <w:szCs w:val="18"/>
+              </w:rPr>
+            </w:pPr>
+            <w:r>
+              <w:rPr>
+                <w:rFonts w:asciiTheme="majorBidi" w:hAnsiTheme="majorBidi" w:cstheme="majorBidi"/>
+                <w:sz w:val="18"/>
+                <w:szCs w:val="18"/>
+              </w:rPr>
+              <w:t xml:space="preserve">Information Theory</w:t>
+            </w:r>
+          </w:p>
+        </w:tc>
+        <w:tc>
+          <w:tcPr>
+            <w:tcW w:w="338" w:type="pct"/>
+          </w:tcPr>
+          <w:p>
+            <w:pPr>
+              <w:keepNext/>
+              <w:keepLines/>
+              <w:bidi w:val="0"/>
+              <w:spacing w:after="0"/>
+              <w:rPr>
+                <w:rFonts w:asciiTheme="majorBidi" w:hAnsiTheme="majorBidi" w:cstheme="majorBidi"/>
+                <w:sz w:val="18"/>
+                <w:szCs w:val="18"/>
+              </w:rPr>
+            </w:pPr>
+            <w:r>
+              <w:rPr>
+                <w:rFonts w:asciiTheme="majorBidi" w:hAnsiTheme="majorBidi" w:cstheme="majorBidi"/>
+                <w:sz w:val="18"/>
+                <w:szCs w:val="18"/>
+              </w:rPr>
+              <w:t xml:space="preserve">77.0</w:t>
+            </w:r>
+          </w:p>
+        </w:tc>
+        <w:tc>
+          <w:tcPr>
+            <w:tcW w:w="339" w:type="pct"/>
+          </w:tcPr>
+          <w:p>
+            <w:pPr>
+              <w:keepNext/>
+              <w:keepLines/>
+              <w:bidi w:val="0"/>
+              <w:spacing w:after="0"/>
+              <w:rPr>
+                <w:rFonts w:asciiTheme="majorBidi" w:hAnsiTheme="majorBidi" w:cstheme="majorBidi"/>
+                <w:sz w:val="18"/>
+                <w:szCs w:val="18"/>
+              </w:rPr>
+            </w:pPr>
+            <w:r>
+              <w:rPr>
+                <w:rFonts w:asciiTheme="majorBidi" w:hAnsiTheme="majorBidi" w:cstheme="majorBidi"/>
+                <w:sz w:val="18"/>
+                <w:szCs w:val="18"/>
+              </w:rPr>
+              <w:t xml:space="preserve">3</w:t>
+            </w:r>
+          </w:p>
+        </w:tc>
+        <w:tc>
+          <w:tcPr>
+            <w:tcW w:w="1831" w:type="pct"/>
+          </w:tcPr>
+          <w:p>
+            <w:pPr>
+              <w:keepNext/>
+              <w:keepLines/>
+              <w:bidi w:val="0"/>
+              <w:spacing w:after="0"/>
+              <w:rPr>
+                <w:rFonts w:asciiTheme="majorBidi" w:hAnsiTheme="majorBidi" w:cstheme="majorBidi"/>
+                <w:sz w:val="18"/>
+                <w:szCs w:val="18"/>
+              </w:rPr>
+            </w:pPr>
+            <w:r>
+              <w:rPr>
+                <w:rFonts w:asciiTheme="majorBidi" w:hAnsiTheme="majorBidi" w:cstheme="majorBidi"/>
+                <w:sz w:val="18"/>
+                <w:szCs w:val="18"/>
+              </w:rPr>
+              <w:t xml:space="preserve"/>
+            </w:r>
+          </w:p>
+        </w:tc>
+        <w:tc>
+          <w:tcPr>
+            <w:tcW w:w="339" w:type="pct"/>
+          </w:tcPr>
+          <w:p>
+            <w:pPr>
+              <w:keepNext/>
+              <w:keepLines/>
+              <w:bidi w:val="0"/>
+              <w:spacing w:after="0"/>
+              <w:rPr>
+                <w:rFonts w:asciiTheme="majorBidi" w:hAnsiTheme="majorBidi" w:cstheme="majorBidi"/>
+                <w:sz w:val="18"/>
+                <w:szCs w:val="18"/>
+              </w:rPr>
+            </w:pPr>
+            <w:r>
+              <w:rPr>
+                <w:rFonts w:asciiTheme="majorBidi" w:hAnsiTheme="majorBidi" w:cstheme="majorBidi"/>
+                <w:sz w:val="18"/>
+                <w:szCs w:val="18"/>
+              </w:rPr>
+              <w:t xml:space="preserve"/>
+            </w:r>
+          </w:p>
+        </w:tc>
+        <w:tc>
+          <w:tcPr>
+            <w:tcW w:w="325" w:type="pct"/>
+          </w:tcPr>
+          <w:p>
+            <w:pPr>
+              <w:keepNext/>
+              <w:keepLines/>
+              <w:bidi w:val="0"/>
+              <w:spacing w:after="0"/>
+              <w:rPr>
+                <w:rFonts w:asciiTheme="majorBidi" w:hAnsiTheme="majorBidi" w:cstheme="majorBidi"/>
+                <w:sz w:val="18"/>
+                <w:szCs w:val="18"/>
+              </w:rPr>
+            </w:pPr>
+            <w:r>
+              <w:rPr>
+                <w:rFonts w:asciiTheme="majorBidi" w:hAnsiTheme="majorBidi" w:cstheme="majorBidi"/>
+                <w:sz w:val="18"/>
+                <w:szCs w:val="18"/>
+              </w:rPr>
+              <w:t xml:space="preserve"/>
             </w:r>
           </w:p>
         </w:tc>
@@ -6263,6 +6831,9 @@
         <w:bidi w:val="0"/>
         <w:spacing w:line="240" w:lineRule="auto"/>
       </w:pPr>
+      <w:r>
+        <w:t xml:space="preserve"/>
+      </w:r>
     </w:p>
     <w:p>
       <w:pPr>
@@ -6336,7 +6907,7 @@
                 <w:b/>
                 <w:bCs/>
               </w:rPr>
-              <w:t xml:space="preserve"> </w:t>
+              <w:t xml:space="preserve">Lact. Dr. Mortaja A. Saary</w:t>
             </w:r>
           </w:p>
           <w:p>
@@ -6345,6 +6916,12 @@
               <w:spacing w:after="0"/>
               <w:jc w:val="center"/>
             </w:pPr>
+            <w:r>
+              <w:rPr>
+                <w:rFonts w:asciiTheme="majorBidi" w:hAnsiTheme="majorBidi" w:cstheme="majorBidi"/>
+              </w:rPr>
+              <w:t xml:space="preserve">Admintion Manager</w:t>
+            </w:r>
           </w:p>
         </w:tc>
         <w:tc>
@@ -6368,7 +6945,7 @@
         </w:tc>
         <w:tc>
           <w:tcPr>
-            <w:tcW w:w="2405" w:type="pct"/>
+            <w:tcW w:w="2404" w:type="pct"/>
             <w:vAlign w:val="center"/>
           </w:tcPr>
           <w:p>
@@ -6388,7 +6965,7 @@
                 <w:b/>
                 <w:bCs/>
               </w:rPr>
-              <w:t xml:space="preserve"> </w:t>
+              <w:t xml:space="preserve">Prof. Dr. Raidah S. Khudhair</w:t>
             </w:r>
           </w:p>
           <w:p>
@@ -6397,6 +6974,12 @@
               <w:spacing w:after="0"/>
               <w:jc w:val="center"/>
             </w:pPr>
+            <w:r>
+              <w:rPr>
+                <w:rFonts w:asciiTheme="majorBidi" w:hAnsiTheme="majorBidi" w:cstheme="majorBidi"/>
+              </w:rPr>
+              <w:t xml:space="preserve">Dean Assistant for Scientific Affairs and Postgraduate Studies</w:t>
+            </w:r>
           </w:p>
         </w:tc>
       </w:tr>
@@ -6438,7 +7021,7 @@
         </w:tc>
         <w:tc>
           <w:tcPr>
-            <w:tcW w:w="2405" w:type="pct"/>
+            <w:tcW w:w="2404" w:type="pct"/>
             <w:vAlign w:val="center"/>
           </w:tcPr>
           <w:p>
@@ -6462,8 +7045,38 @@
           <w:p>
             <w:pPr>
               <w:bidi w:val="0"/>
+              <w:spacing w:after="0"/>
               <w:jc w:val="center"/>
-            </w:pPr>
+              <w:rPr>
+                <w:rFonts w:asciiTheme="majorBidi" w:hAnsiTheme="majorBidi" w:cstheme="majorBidi"/>
+                <w:b/>
+                <w:bCs/>
+              </w:rPr>
+            </w:pPr>
+            <w:r>
+              <w:rPr>
+                <w:rFonts w:asciiTheme="majorBidi" w:hAnsiTheme="majorBidi" w:cstheme="majorBidi"/>
+                <w:b/>
+                <w:bCs/>
+              </w:rPr>
+              <w:t xml:space="preserve">Asst. Prof. Dr. Haider K. Mehbes</w:t>
+            </w:r>
+          </w:p>
+          <w:p>
+            <w:pPr>
+              <w:bidi w:val="0"/>
+              <w:spacing w:after="0"/>
+              <w:jc w:val="center"/>
+              <w:rPr>
+                <w:rFonts w:asciiTheme="majorBidi" w:hAnsiTheme="majorBidi" w:cstheme="majorBidi"/>
+              </w:rPr>
+            </w:pPr>
+            <w:r>
+              <w:rPr>
+                <w:rFonts w:asciiTheme="majorBidi" w:hAnsiTheme="majorBidi" w:cstheme="majorBidi"/>
+              </w:rPr>
+              <w:t xml:space="preserve">Vice Chancellor for Scientific Affairs</w:t>
+            </w:r>
           </w:p>
         </w:tc>
         <w:tc>
@@ -6484,66 +7097,6 @@
               </w:rPr>
             </w:pPr>
           </w:p>
-        </w:tc>
-        <w:tc>
-          <w:tcPr>
-            <w:tcW w:w="2405" w:type="pct"/>
-            <w:vAlign w:val="center"/>
-          </w:tcPr>
-          <w:p>
-            <w:pPr>
-              <w:bidi w:val="0"/>
-              <w:jc w:val="center"/>
-            </w:pPr>
-          </w:p>
-        </w:tc>
-      </w:tr>
-      <w:tr>
-        <w:trPr>
-          <w:trHeight w:val="828"/>
-          <w:jc w:val="right"/>
-        </w:trPr>
-        <w:tc>
-          <w:tcPr>
-            <w:tcW w:w="2405" w:type="pct"/>
-            <w:vAlign w:val="center"/>
-          </w:tcPr>
-          <w:p>
-            <w:pPr>
-              <w:bidi w:val="0"/>
-              <w:spacing w:after="0"/>
-              <w:jc w:val="center"/>
-              <w:rPr>
-                <w:rFonts w:asciiTheme="majorBidi" w:hAnsiTheme="majorBidi" w:cstheme="majorBidi"/>
-                <w:b/>
-                <w:bCs/>
-              </w:rPr>
-            </w:pPr>
-            <w:r>
-              <w:rPr>
-                <w:rFonts w:asciiTheme="majorBidi" w:hAnsiTheme="majorBidi" w:cstheme="majorBidi"/>
-                <w:b/>
-                <w:bCs/>
-              </w:rPr>
-              <w:t xml:space="preserve"> </w:t>
-            </w:r>
-          </w:p>
-          <w:p>
-            <w:pPr>
-              <w:bidi w:val="0"/>
-              <w:spacing w:after="0"/>
-              <w:jc w:val="center"/>
-              <w:rPr>
-                <w:rFonts w:asciiTheme="majorBidi" w:hAnsiTheme="majorBidi" w:cstheme="majorBidi"/>
-              </w:rPr>
-            </w:pPr>
-          </w:p>
-        </w:tc>
-        <w:tc>
-          <w:tcPr>
-            <w:tcW w:w="191" w:type="pct"/>
-            <w:vAlign w:val="center"/>
-          </w:tcPr>
           <w:p>
             <w:pPr>
               <w:bidi w:val="0"/>
@@ -6570,23 +7123,10 @@
               </w:rPr>
             </w:pPr>
           </w:p>
-          <w:p>
-            <w:pPr>
-              <w:bidi w:val="0"/>
-              <w:spacing w:after="0" w:line="240" w:lineRule="auto"/>
-              <w:jc w:val="center"/>
-              <w:rPr>
-                <w:sz w:val="24"/>
-                <w:szCs w:val="24"/>
-                <w:rtl/>
-                <w:lang w:bidi="ar-IQ"/>
-              </w:rPr>
-            </w:pPr>
-          </w:p>
-        </w:tc>
-        <w:tc>
-          <w:tcPr>
-            <w:tcW w:w="2405" w:type="pct"/>
+        </w:tc>
+        <w:tc>
+          <w:tcPr>
+            <w:tcW w:w="2404" w:type="pct"/>
             <w:vAlign w:val="center"/>
           </w:tcPr>
           <w:p>
@@ -6606,7 +7146,7 @@
                 <w:b/>
                 <w:bCs/>
               </w:rPr>
-              <w:t xml:space="preserve"> </w:t>
+              <w:t xml:space="preserve">Prof. Dr. Husham K. Hashim</w:t>
             </w:r>
           </w:p>
           <w:p>
@@ -6618,6 +7158,12 @@
                 <w:rFonts w:asciiTheme="majorBidi" w:hAnsiTheme="majorBidi" w:cstheme="majorBidi"/>
               </w:rPr>
             </w:pPr>
+            <w:r>
+              <w:rPr>
+                <w:rFonts w:asciiTheme="majorBidi" w:hAnsiTheme="majorBidi" w:cstheme="majorBidi"/>
+              </w:rPr>
+              <w:t xml:space="preserve">The Dean</w:t>
+            </w:r>
           </w:p>
         </w:tc>
       </w:tr>
@@ -6655,16 +7201,25 @@
         <w:bidi w:val="0"/>
         <w:spacing w:after="0" w:line="240" w:lineRule="auto"/>
         <w:rPr>
+          <w:rFonts w:asciiTheme="minorBidi" w:hAnsiTheme="minorBidi" w:cstheme="minorBidi"/>
           <w:sz w:val="24"/>
           <w:szCs w:val="24"/>
           <w:lang w:bidi="ar-IQ"/>
         </w:rPr>
       </w:pPr>
+      <w:r>
+        <w:rPr>
+          <w:rFonts w:asciiTheme="minorBidi" w:hAnsiTheme="minorBidi" w:cstheme="minorBidi"/>
+        </w:rPr>
+        <w:lastRenderedPageBreak/>
+        <w:t xml:space="preserve"/>
+      </w:r>
     </w:p>
     <w:p>
       <w:pPr>
         <w:bidi w:val="0"/>
         <w:rPr>
+          <w:rFonts w:asciiTheme="minorBidi" w:hAnsiTheme="minorBidi" w:cstheme="minorBidi"/>
           <w:sz w:val="24"/>
           <w:szCs w:val="24"/>
           <w:rtl/>
@@ -6705,14 +7260,14 @@
               <w:bidi w:val="0"/>
               <w:jc w:val="center"/>
               <w:rPr>
-                <w:rFonts w:asciiTheme="majorBidi" w:hAnsiTheme="majorBidi" w:cstheme="majorBidi"/>
+                <w:rFonts w:asciiTheme="minorBidi" w:hAnsiTheme="minorBidi" w:cstheme="minorBidi"/>
                 <w:b/>
                 <w:bCs/>
               </w:rPr>
             </w:pPr>
             <w:r>
               <w:rPr>
-                <w:rFonts w:asciiTheme="majorBidi" w:hAnsiTheme="majorBidi" w:cstheme="majorBidi"/>
+                <w:rFonts w:asciiTheme="minorBidi" w:hAnsiTheme="minorBidi" w:cstheme="minorBidi"/>
                 <w:b/>
                 <w:bCs/>
               </w:rPr>
@@ -6724,14 +7279,14 @@
               <w:bidi w:val="0"/>
               <w:jc w:val="center"/>
               <w:rPr>
-                <w:rFonts w:asciiTheme="majorBidi" w:hAnsiTheme="majorBidi" w:cstheme="majorBidi"/>
-              </w:rPr>
-            </w:pPr>
-            <w:r>
-              <w:rPr>
-                <w:rFonts w:asciiTheme="majorBidi" w:hAnsiTheme="majorBidi" w:cstheme="majorBidi"/>
-              </w:rPr>
-              <w:t>Graduate Officer</w:t>
+                <w:rFonts w:asciiTheme="minorBidi" w:hAnsiTheme="minorBidi" w:cstheme="minorBidi"/>
+              </w:rPr>
+            </w:pPr>
+            <w:r>
+              <w:rPr>
+                <w:rFonts w:asciiTheme="minorBidi" w:hAnsiTheme="minorBidi" w:cstheme="minorBidi"/>
+              </w:rPr>
+              <w:t xml:space="preserve">Graduate Officer</w:t>
             </w:r>
           </w:p>
         </w:tc>
@@ -6745,14 +7300,14 @@
               <w:bidi w:val="0"/>
               <w:jc w:val="center"/>
               <w:rPr>
-                <w:rFonts w:asciiTheme="majorBidi" w:hAnsiTheme="majorBidi" w:cstheme="majorBidi"/>
+                <w:rFonts w:asciiTheme="minorBidi" w:hAnsiTheme="minorBidi" w:cstheme="minorBidi"/>
                 <w:b/>
                 <w:bCs/>
               </w:rPr>
             </w:pPr>
             <w:r>
               <w:rPr>
-                <w:rFonts w:asciiTheme="majorBidi" w:hAnsiTheme="majorBidi" w:cstheme="majorBidi"/>
+                <w:rFonts w:asciiTheme="minorBidi" w:hAnsiTheme="minorBidi" w:cstheme="minorBidi"/>
                 <w:b/>
                 <w:bCs/>
               </w:rPr>
@@ -6764,29 +7319,19 @@
               <w:bidi w:val="0"/>
               <w:jc w:val="center"/>
               <w:rPr>
-                <w:rFonts w:asciiTheme="majorBidi" w:hAnsiTheme="majorBidi" w:cstheme="majorBidi"/>
-              </w:rPr>
-            </w:pPr>
-            <w:r>
-              <w:rPr>
-                <w:rFonts w:asciiTheme="majorBidi" w:hAnsiTheme="majorBidi" w:cstheme="majorBidi"/>
-              </w:rPr>
-              <w:t>Certificate Arrangement</w:t>
+                <w:rFonts w:asciiTheme="minorBidi" w:hAnsiTheme="minorBidi" w:cstheme="minorBidi"/>
+              </w:rPr>
+            </w:pPr>
+            <w:r>
+              <w:rPr>
+                <w:rFonts w:asciiTheme="minorBidi" w:hAnsiTheme="minorBidi" w:cstheme="minorBidi"/>
+              </w:rPr>
+              <w:t xml:space="preserve">Certificate Arrangement</w:t>
             </w:r>
           </w:p>
         </w:tc>
       </w:tr>
     </w:tbl>
-    <w:p>
-      <w:pPr>
-        <w:bidi w:val="0"/>
-        <w:rPr>
-          <w:sz w:val="24"/>
-          <w:szCs w:val="24"/>
-          <w:lang w:bidi="ar-IQ"/>
-        </w:rPr>
-      </w:pPr>
-    </w:p>
     <w:p>
       <w:pPr>
         <w:pStyle w:val="ListParagraph"/>
@@ -6796,13 +7341,18 @@
         </w:numPr>
         <w:bidi w:val="0"/>
         <w:rPr>
+          <w:rFonts w:asciiTheme="minorBidi" w:hAnsiTheme="minorBidi" w:cstheme="minorBidi"/>
           <w:sz w:val="24"/>
           <w:szCs w:val="24"/>
+          <w:rtl/>
           <w:lang w:bidi="ar-IQ"/>
         </w:rPr>
       </w:pPr>
       <w:r>
-        <w:t>Summer Training: The student completed the requirement of summer training in the academic year .</w:t>
+        <w:rPr>
+          <w:rFonts w:asciiTheme="minorBidi" w:hAnsiTheme="minorBidi" w:cstheme="minorBidi"/>
+        </w:rPr>
+        <w:t xml:space="preserve">The University order No: 15710/13/3 in 2020-11-17</w:t>
       </w:r>
     </w:p>
     <w:p>
@@ -6814,41 +7364,35 @@
         </w:numPr>
         <w:bidi w:val="0"/>
         <w:rPr>
-          <w:sz w:val="24"/>
-          <w:szCs w:val="24"/>
-          <w:rtl/>
-          <w:lang w:bidi="ar-IQ"/>
-        </w:rPr>
-      </w:pPr>
-      <w:r>
-        <w:t>The University order No: 15710/13/3 in 2020-11-17</w:t>
-      </w:r>
-    </w:p>
-    <w:p>
-      <w:pPr>
-        <w:pStyle w:val="ListParagraph"/>
-        <w:numPr>
-          <w:ilvl w:val="0"/>
-          <w:numId w:val="28"/>
-        </w:numPr>
-        <w:bidi w:val="0"/>
-        <w:rPr>
+          <w:rFonts w:asciiTheme="minorBidi" w:hAnsiTheme="minorBidi" w:cstheme="minorBidi"/>
           <w:sz w:val="24"/>
           <w:szCs w:val="24"/>
           <w:lang w:bidi="ar-IQ"/>
         </w:rPr>
       </w:pPr>
       <w:r>
+        <w:rPr>
+          <w:rFonts w:asciiTheme="minorBidi" w:hAnsiTheme="minorBidi" w:cstheme="minorBidi"/>
+        </w:rPr>
         <w:t>Grades:</w:t>
       </w:r>
       <w:r>
+        <w:rPr>
+          <w:rFonts w:asciiTheme="minorBidi" w:hAnsiTheme="minorBidi" w:cstheme="minorBidi"/>
+        </w:rPr>
         <w:tab/>
         <w:t>Fair</w:t>
       </w:r>
       <w:r>
+        <w:rPr>
+          <w:rFonts w:asciiTheme="minorBidi" w:hAnsiTheme="minorBidi" w:cstheme="minorBidi"/>
+        </w:rPr>
         <w:tab/>
       </w:r>
       <w:r>
+        <w:rPr>
+          <w:rFonts w:asciiTheme="minorBidi" w:hAnsiTheme="minorBidi" w:cstheme="minorBidi"/>
+        </w:rPr>
         <w:tab/>
         <w:t>(50 - less than 60)</w:t>
       </w:r>
@@ -6859,15 +7403,22 @@
         <w:bidi w:val="0"/>
         <w:ind w:left="1440"/>
         <w:rPr>
+          <w:rFonts w:asciiTheme="minorBidi" w:hAnsiTheme="minorBidi" w:cstheme="minorBidi"/>
           <w:sz w:val="24"/>
           <w:szCs w:val="24"/>
           <w:lang w:bidi="ar-IQ"/>
         </w:rPr>
       </w:pPr>
       <w:r>
+        <w:rPr>
+          <w:rFonts w:asciiTheme="minorBidi" w:hAnsiTheme="minorBidi" w:cstheme="minorBidi"/>
+        </w:rPr>
         <w:t>Medium</w:t>
       </w:r>
       <w:r>
+        <w:rPr>
+          <w:rFonts w:asciiTheme="minorBidi" w:hAnsiTheme="minorBidi" w:cstheme="minorBidi"/>
+        </w:rPr>
         <w:tab/>
         <w:t>(60- less than 70)</w:t>
       </w:r>
@@ -6878,18 +7429,28 @@
         <w:bidi w:val="0"/>
         <w:ind w:left="1440"/>
         <w:rPr>
+          <w:rFonts w:asciiTheme="minorBidi" w:hAnsiTheme="minorBidi" w:cstheme="minorBidi"/>
           <w:sz w:val="24"/>
           <w:szCs w:val="24"/>
           <w:lang w:bidi="ar-IQ"/>
         </w:rPr>
       </w:pPr>
       <w:r>
+        <w:rPr>
+          <w:rFonts w:asciiTheme="minorBidi" w:hAnsiTheme="minorBidi" w:cstheme="minorBidi"/>
+        </w:rPr>
         <w:t>Good</w:t>
       </w:r>
       <w:r>
+        <w:rPr>
+          <w:rFonts w:asciiTheme="minorBidi" w:hAnsiTheme="minorBidi" w:cstheme="minorBidi"/>
+        </w:rPr>
         <w:tab/>
       </w:r>
       <w:r>
+        <w:rPr>
+          <w:rFonts w:asciiTheme="minorBidi" w:hAnsiTheme="minorBidi" w:cstheme="minorBidi"/>
+        </w:rPr>
         <w:tab/>
         <w:t>(70- less than 80)</w:t>
       </w:r>
@@ -6900,15 +7461,22 @@
         <w:bidi w:val="0"/>
         <w:ind w:left="1440"/>
         <w:rPr>
+          <w:rFonts w:asciiTheme="minorBidi" w:hAnsiTheme="minorBidi" w:cstheme="minorBidi"/>
           <w:sz w:val="24"/>
           <w:szCs w:val="24"/>
           <w:lang w:bidi="ar-IQ"/>
         </w:rPr>
       </w:pPr>
       <w:r>
+        <w:rPr>
+          <w:rFonts w:asciiTheme="minorBidi" w:hAnsiTheme="minorBidi" w:cstheme="minorBidi"/>
+        </w:rPr>
         <w:t>Very good</w:t>
       </w:r>
       <w:r>
+        <w:rPr>
+          <w:rFonts w:asciiTheme="minorBidi" w:hAnsiTheme="minorBidi" w:cstheme="minorBidi"/>
+        </w:rPr>
         <w:tab/>
         <w:t>(80- less than 90)</w:t>
       </w:r>
@@ -6919,19 +7487,29 @@
         <w:bidi w:val="0"/>
         <w:ind w:left="1440"/>
         <w:rPr>
+          <w:rFonts w:asciiTheme="minorBidi" w:hAnsiTheme="minorBidi" w:cstheme="minorBidi"/>
           <w:sz w:val="24"/>
           <w:szCs w:val="24"/>
           <w:lang w:bidi="ar-IQ"/>
         </w:rPr>
       </w:pPr>
       <w:r>
+        <w:rPr>
+          <w:rFonts w:asciiTheme="minorBidi" w:hAnsiTheme="minorBidi" w:cstheme="minorBidi"/>
+        </w:rPr>
         <w:t>Excellent</w:t>
       </w:r>
       <w:r>
+        <w:rPr>
+          <w:rFonts w:asciiTheme="minorBidi" w:hAnsiTheme="minorBidi" w:cstheme="minorBidi"/>
+        </w:rPr>
         <w:tab/>
-        <w:t>(90-100)</w:t>
+        <w:t xml:space="preserve">(90-100)</w:t>
       </w:r>
       <w:r>
+        <w:rPr>
+          <w:rFonts w:asciiTheme="minorBidi" w:hAnsiTheme="minorBidi" w:cstheme="minorBidi"/>
+        </w:rPr>
         <w:tab/>
       </w:r>
     </w:p>
@@ -6944,13 +7522,45 @@
         </w:numPr>
         <w:bidi w:val="0"/>
         <w:rPr>
+          <w:rFonts w:asciiTheme="minorBidi" w:hAnsiTheme="minorBidi" w:cstheme="minorBidi"/>
           <w:sz w:val="24"/>
           <w:szCs w:val="24"/>
           <w:lang w:bidi="ar-IQ"/>
         </w:rPr>
       </w:pPr>
       <w:r>
-        <w:t>The Medium Of Instruction During The Entire Was English.</w:t>
+        <w:rPr>
+          <w:rFonts w:asciiTheme="minorBidi" w:hAnsiTheme="minorBidi" w:cstheme="minorBidi"/>
+        </w:rPr>
+        <w:t xml:space="preserve">The Medium </w:t>
+      </w:r>
+      <w:proofErr w:type="gramStart"/>
+      <w:r>
+        <w:rPr>
+          <w:rFonts w:asciiTheme="minorBidi" w:hAnsiTheme="minorBidi" w:cstheme="minorBidi"/>
+        </w:rPr>
+        <w:t>Of</w:t>
+      </w:r>
+      <w:proofErr w:type="gramEnd"/>
+      <w:r>
+        <w:rPr>
+          <w:rFonts w:asciiTheme="minorBidi" w:hAnsiTheme="minorBidi" w:cstheme="minorBidi"/>
+        </w:rPr>
+        <w:t xml:space="preserve"> Instruction During </w:t>
+      </w:r>
+      <w:proofErr w:type="gramStart"/>
+      <w:r>
+        <w:rPr>
+          <w:rFonts w:asciiTheme="minorBidi" w:hAnsiTheme="minorBidi" w:cstheme="minorBidi"/>
+        </w:rPr>
+        <w:t>The</w:t>
+      </w:r>
+      <w:proofErr w:type="gramEnd"/>
+      <w:r>
+        <w:rPr>
+          <w:rFonts w:asciiTheme="minorBidi" w:hAnsiTheme="minorBidi" w:cstheme="minorBidi"/>
+        </w:rPr>
+        <w:t xml:space="preserve"> Entire Was English.</w:t>
       </w:r>
     </w:p>
     <w:p>
@@ -6962,6 +7572,7 @@
         </w:numPr>
         <w:bidi w:val="0"/>
         <w:rPr>
+          <w:rFonts w:asciiTheme="minorBidi" w:hAnsiTheme="minorBidi" w:cstheme="minorBidi"/>
           <w:sz w:val="24"/>
           <w:szCs w:val="24"/>
           <w:rtl/>
@@ -6969,7 +7580,24 @@
         </w:rPr>
       </w:pPr>
       <w:r>
-        <w:t>The Certificate is Free From Scratches and Corrections.</w:t>
+        <w:rPr>
+          <w:rFonts w:asciiTheme="minorBidi" w:hAnsiTheme="minorBidi" w:cstheme="minorBidi"/>
+        </w:rPr>
+        <w:t xml:space="preserve">The Certificate is Free </w:t>
+      </w:r>
+      <w:proofErr w:type="gramStart"/>
+      <w:r>
+        <w:rPr>
+          <w:rFonts w:asciiTheme="minorBidi" w:hAnsiTheme="minorBidi" w:cstheme="minorBidi"/>
+        </w:rPr>
+        <w:t>From</w:t>
+      </w:r>
+      <w:proofErr w:type="gramEnd"/>
+      <w:r>
+        <w:rPr>
+          <w:rFonts w:asciiTheme="minorBidi" w:hAnsiTheme="minorBidi" w:cstheme="minorBidi"/>
+        </w:rPr>
+        <w:t xml:space="preserve"> Scratches and Corrections.</w:t>
       </w:r>
     </w:p>
     <w:p>
@@ -7128,7 +7756,7 @@
         <w:noProof/>
         <w:lang w:bidi="ar-IQ"/>
       </w:rPr>
-      <w:instrText>3</w:instrText>
+      <w:instrText>2</w:instrText>
     </w:r>
     <w:r>
       <w:rPr>
@@ -7153,7 +7781,7 @@
         <w:noProof/>
         <w:lang w:bidi="ar-IQ"/>
       </w:rPr>
-      <w:t>-2</w:t>
+      <w:t>-1</w:t>
     </w:r>
     <w:r>
       <w:rPr>

</xml_diff>

<commit_message>
new file:   "certificates/semester - Temp - Ar - D - SBS - \330\247\330\257\331\212\330\247\331\206 \330\271\330\250\330\257\330\247\331\204\330\247\331\205\331\212\330\261 \331\201\330\256\330\261\331\212 \330\247\330\255\331\205\330\257.docx" 	modified:   "certificates/semester - Temp - Ar - D - SBS - \330\257\330\247\331\206\331\212\330\247 \330\247\330\255\331\205\330\257 \330\264\331\207\330\247\330\250 \330\247\330\255\331\205\330\257.docx" 	new file:   certificates/semester - Temp - En - D - SBS - Adian Abdulameer Fakhri Al-Asadi.docx 	modified:   certificates/semester - Temp - En - D - SBS - Danya Ahmed Shehab Alalwan.docx
</commit_message>
<xml_diff>
--- a/certificates/semester - Temp - En - D - SBS - Danya Ahmed Shehab Alalwan.docx
+++ b/certificates/semester - Temp - En - D - SBS - Danya Ahmed Shehab Alalwan.docx
@@ -236,7 +236,7 @@
               </w:rPr>
             </w:pPr>
             <w:r>
-              <w:t xml:space="preserve">Place and Date of Birth: 2000-01-01 -Basra</w:t>
+              <w:t xml:space="preserve">Place and Date of Birth: ‎2001/01/01‎ -Basra</w:t>
             </w:r>
           </w:p>
         </w:tc>
@@ -396,7 +396,7 @@
               </w:rPr>
             </w:pPr>
             <w:r>
-              <w:t xml:space="preserve">Date of Graduation: 2020-11-17</w:t>
+              <w:t xml:space="preserve">Date of Graduation: ‎2020/11/17‎</w:t>
             </w:r>
           </w:p>
         </w:tc>
@@ -651,7 +651,7 @@
                 <w:sz w:val="18"/>
                 <w:szCs w:val="18"/>
               </w:rPr>
-              <w:t xml:space="preserve">Semester 1 - 2015-2016</w:t>
+              <w:t xml:space="preserve">Stage 1 - 2015-2016</w:t>
             </w:r>
           </w:p>
         </w:tc>
@@ -678,7 +678,7 @@
                 <w:sz w:val="18"/>
                 <w:szCs w:val="18"/>
               </w:rPr>
-              <w:t xml:space="preserve">Semester 2 - 2015-2016</w:t>
+              <w:t xml:space="preserve">Stage 2 - 2015-2016</w:t>
             </w:r>
           </w:p>
         </w:tc>
@@ -896,7 +896,7 @@
                 <w:sz w:val="18"/>
                 <w:szCs w:val="18"/>
               </w:rPr>
-              <w:t xml:space="preserve">78.0</w:t>
+              <w:t xml:space="preserve">78</w:t>
             </w:r>
           </w:p>
         </w:tc>
@@ -974,7 +974,7 @@
                 <w:sz w:val="18"/>
                 <w:szCs w:val="18"/>
               </w:rPr>
-              <w:t xml:space="preserve">53.0</w:t>
+              <w:t xml:space="preserve">53</w:t>
             </w:r>
           </w:p>
         </w:tc>
@@ -1057,7 +1057,7 @@
                 <w:sz w:val="18"/>
                 <w:szCs w:val="18"/>
               </w:rPr>
-              <w:t xml:space="preserve">56.0</w:t>
+              <w:t xml:space="preserve">56</w:t>
             </w:r>
           </w:p>
         </w:tc>
@@ -1135,7 +1135,7 @@
                 <w:sz w:val="18"/>
                 <w:szCs w:val="18"/>
               </w:rPr>
-              <w:t xml:space="preserve">83.0</w:t>
+              <w:t xml:space="preserve">83</w:t>
             </w:r>
           </w:p>
         </w:tc>
@@ -1218,7 +1218,7 @@
                 <w:sz w:val="18"/>
                 <w:szCs w:val="18"/>
               </w:rPr>
-              <w:t xml:space="preserve">53.0</w:t>
+              <w:t xml:space="preserve">53</w:t>
             </w:r>
           </w:p>
         </w:tc>
@@ -1296,7 +1296,7 @@
                 <w:sz w:val="18"/>
                 <w:szCs w:val="18"/>
               </w:rPr>
-              <w:t xml:space="preserve">75.0</w:t>
+              <w:t xml:space="preserve">75</w:t>
             </w:r>
           </w:p>
         </w:tc>
@@ -1379,7 +1379,7 @@
                 <w:sz w:val="18"/>
                 <w:szCs w:val="18"/>
               </w:rPr>
-              <w:t xml:space="preserve">71.0</w:t>
+              <w:t xml:space="preserve">71</w:t>
             </w:r>
           </w:p>
         </w:tc>
@@ -1457,7 +1457,7 @@
                 <w:sz w:val="18"/>
                 <w:szCs w:val="18"/>
               </w:rPr>
-              <w:t xml:space="preserve">50.0</w:t>
+              <w:t xml:space="preserve">50</w:t>
             </w:r>
           </w:p>
         </w:tc>
@@ -1540,7 +1540,7 @@
                 <w:sz w:val="18"/>
                 <w:szCs w:val="18"/>
               </w:rPr>
-              <w:t xml:space="preserve">60.0</w:t>
+              <w:t xml:space="preserve">60</w:t>
             </w:r>
           </w:p>
         </w:tc>
@@ -1618,7 +1618,7 @@
                 <w:sz w:val="18"/>
                 <w:szCs w:val="18"/>
               </w:rPr>
-              <w:t xml:space="preserve">61.0</w:t>
+              <w:t xml:space="preserve">61</w:t>
             </w:r>
           </w:p>
         </w:tc>
@@ -1701,7 +1701,7 @@
                 <w:sz w:val="18"/>
                 <w:szCs w:val="18"/>
               </w:rPr>
-              <w:t xml:space="preserve">63.0</w:t>
+              <w:t xml:space="preserve">63</w:t>
             </w:r>
           </w:p>
         </w:tc>
@@ -1779,7 +1779,7 @@
                 <w:sz w:val="18"/>
                 <w:szCs w:val="18"/>
               </w:rPr>
-              <w:t xml:space="preserve">50.0</w:t>
+              <w:t xml:space="preserve">50</w:t>
             </w:r>
           </w:p>
         </w:tc>
@@ -1862,7 +1862,7 @@
                 <w:sz w:val="18"/>
                 <w:szCs w:val="18"/>
               </w:rPr>
-              <w:t xml:space="preserve">58.0</w:t>
+              <w:t xml:space="preserve">58</w:t>
             </w:r>
           </w:p>
         </w:tc>
@@ -2025,7 +2025,7 @@
                 <w:sz w:val="18"/>
                 <w:szCs w:val="18"/>
               </w:rPr>
-              <w:t xml:space="preserve">Semester 3 - 2016-2017</w:t>
+              <w:t xml:space="preserve">Stage 3 - 2016-2017</w:t>
             </w:r>
           </w:p>
         </w:tc>
@@ -2052,7 +2052,7 @@
                 <w:sz w:val="18"/>
                 <w:szCs w:val="18"/>
               </w:rPr>
-              <w:t xml:space="preserve">Semester 4 - 2016-2017</w:t>
+              <w:t xml:space="preserve">Stage 4 - 2016-2017</w:t>
             </w:r>
           </w:p>
         </w:tc>
@@ -2270,7 +2270,7 @@
                 <w:sz w:val="18"/>
                 <w:szCs w:val="18"/>
               </w:rPr>
-              <w:t xml:space="preserve">50.0</w:t>
+              <w:t xml:space="preserve">50</w:t>
             </w:r>
           </w:p>
         </w:tc>
@@ -2348,7 +2348,7 @@
                 <w:sz w:val="18"/>
                 <w:szCs w:val="18"/>
               </w:rPr>
-              <w:t xml:space="preserve">50.0</w:t>
+              <w:t xml:space="preserve">50</w:t>
             </w:r>
           </w:p>
         </w:tc>
@@ -2431,7 +2431,7 @@
                 <w:sz w:val="18"/>
                 <w:szCs w:val="18"/>
               </w:rPr>
-              <w:t xml:space="preserve">53.0</w:t>
+              <w:t xml:space="preserve">53</w:t>
             </w:r>
           </w:p>
         </w:tc>
@@ -2509,7 +2509,7 @@
                 <w:sz w:val="18"/>
                 <w:szCs w:val="18"/>
               </w:rPr>
-              <w:t xml:space="preserve">74.0</w:t>
+              <w:t xml:space="preserve">74</w:t>
             </w:r>
           </w:p>
         </w:tc>
@@ -2592,7 +2592,7 @@
                 <w:sz w:val="18"/>
                 <w:szCs w:val="18"/>
               </w:rPr>
-              <w:t xml:space="preserve">67.0</w:t>
+              <w:t xml:space="preserve">67</w:t>
             </w:r>
           </w:p>
         </w:tc>
@@ -2670,7 +2670,7 @@
                 <w:sz w:val="18"/>
                 <w:szCs w:val="18"/>
               </w:rPr>
-              <w:t xml:space="preserve">62.0</w:t>
+              <w:t xml:space="preserve">62</w:t>
             </w:r>
           </w:p>
         </w:tc>
@@ -2753,7 +2753,7 @@
                 <w:sz w:val="18"/>
                 <w:szCs w:val="18"/>
               </w:rPr>
-              <w:t xml:space="preserve">56.0</w:t>
+              <w:t xml:space="preserve">56</w:t>
             </w:r>
           </w:p>
         </w:tc>
@@ -2831,7 +2831,7 @@
                 <w:sz w:val="18"/>
                 <w:szCs w:val="18"/>
               </w:rPr>
-              <w:t xml:space="preserve">61.0</w:t>
+              <w:t xml:space="preserve">61</w:t>
             </w:r>
           </w:p>
         </w:tc>
@@ -2914,7 +2914,7 @@
                 <w:sz w:val="18"/>
                 <w:szCs w:val="18"/>
               </w:rPr>
-              <w:t xml:space="preserve">50.0</w:t>
+              <w:t xml:space="preserve">50</w:t>
             </w:r>
           </w:p>
         </w:tc>
@@ -2992,7 +2992,7 @@
                 <w:sz w:val="18"/>
                 <w:szCs w:val="18"/>
               </w:rPr>
-              <w:t xml:space="preserve">64.0</w:t>
+              <w:t xml:space="preserve">64</w:t>
             </w:r>
           </w:p>
         </w:tc>
@@ -3153,7 +3153,7 @@
                 <w:sz w:val="18"/>
                 <w:szCs w:val="18"/>
               </w:rPr>
-              <w:t xml:space="preserve">79.0</w:t>
+              <w:t xml:space="preserve">79</w:t>
             </w:r>
           </w:p>
         </w:tc>
@@ -3238,7 +3238,7 @@
                 <w:sz w:val="18"/>
                 <w:szCs w:val="18"/>
               </w:rPr>
-              <w:t xml:space="preserve">Semester 5 - 2017-2018</w:t>
+              <w:t xml:space="preserve">Stage 5 - 2017-2018</w:t>
             </w:r>
           </w:p>
         </w:tc>
@@ -3265,7 +3265,7 @@
                 <w:sz w:val="18"/>
                 <w:szCs w:val="18"/>
               </w:rPr>
-              <w:t xml:space="preserve">Semester 6 - 2017-2018</w:t>
+              <w:t xml:space="preserve">Stage 6 - 2017-2018</w:t>
             </w:r>
           </w:p>
         </w:tc>
@@ -3483,7 +3483,7 @@
                 <w:sz w:val="18"/>
                 <w:szCs w:val="18"/>
               </w:rPr>
-              <w:t xml:space="preserve">53.0</w:t>
+              <w:t xml:space="preserve">53</w:t>
             </w:r>
           </w:p>
         </w:tc>
@@ -3561,7 +3561,7 @@
                 <w:sz w:val="18"/>
                 <w:szCs w:val="18"/>
               </w:rPr>
-              <w:t xml:space="preserve">50.0</w:t>
+              <w:t xml:space="preserve">50</w:t>
             </w:r>
           </w:p>
         </w:tc>
@@ -3644,7 +3644,7 @@
                 <w:sz w:val="18"/>
                 <w:szCs w:val="18"/>
               </w:rPr>
-              <w:t xml:space="preserve">66.0</w:t>
+              <w:t xml:space="preserve">66</w:t>
             </w:r>
           </w:p>
         </w:tc>
@@ -3722,7 +3722,7 @@
                 <w:sz w:val="18"/>
                 <w:szCs w:val="18"/>
               </w:rPr>
-              <w:t xml:space="preserve">58.0</w:t>
+              <w:t xml:space="preserve">58</w:t>
             </w:r>
           </w:p>
         </w:tc>
@@ -3805,7 +3805,7 @@
                 <w:sz w:val="18"/>
                 <w:szCs w:val="18"/>
               </w:rPr>
-              <w:t xml:space="preserve">59.0</w:t>
+              <w:t xml:space="preserve">59</w:t>
             </w:r>
           </w:p>
         </w:tc>
@@ -3883,7 +3883,7 @@
                 <w:sz w:val="18"/>
                 <w:szCs w:val="18"/>
               </w:rPr>
-              <w:t xml:space="preserve">78.0</w:t>
+              <w:t xml:space="preserve">78</w:t>
             </w:r>
           </w:p>
         </w:tc>
@@ -3966,7 +3966,7 @@
                 <w:sz w:val="18"/>
                 <w:szCs w:val="18"/>
               </w:rPr>
-              <w:t xml:space="preserve">60.0</w:t>
+              <w:t xml:space="preserve">60</w:t>
             </w:r>
           </w:p>
         </w:tc>
@@ -4044,7 +4044,7 @@
                 <w:sz w:val="18"/>
                 <w:szCs w:val="18"/>
               </w:rPr>
-              <w:t xml:space="preserve">56.0</w:t>
+              <w:t xml:space="preserve">56</w:t>
             </w:r>
           </w:p>
         </w:tc>
@@ -4127,7 +4127,7 @@
                 <w:sz w:val="18"/>
                 <w:szCs w:val="18"/>
               </w:rPr>
-              <w:t xml:space="preserve">63.0</w:t>
+              <w:t xml:space="preserve">63</w:t>
             </w:r>
           </w:p>
         </w:tc>
@@ -4205,7 +4205,7 @@
                 <w:sz w:val="18"/>
                 <w:szCs w:val="18"/>
               </w:rPr>
-              <w:t xml:space="preserve">56.0</w:t>
+              <w:t xml:space="preserve">56</w:t>
             </w:r>
           </w:p>
         </w:tc>
@@ -4288,7 +4288,7 @@
                 <w:sz w:val="18"/>
                 <w:szCs w:val="18"/>
               </w:rPr>
-              <w:t xml:space="preserve">62.0</w:t>
+              <w:t xml:space="preserve">62</w:t>
             </w:r>
           </w:p>
         </w:tc>
@@ -4451,7 +4451,7 @@
                 <w:sz w:val="18"/>
                 <w:szCs w:val="18"/>
               </w:rPr>
-              <w:t xml:space="preserve">Semester 7 - 2018-2019</w:t>
+              <w:t xml:space="preserve">Stage 7 - 2018-2019</w:t>
             </w:r>
           </w:p>
         </w:tc>
@@ -4478,7 +4478,7 @@
                 <w:sz w:val="18"/>
                 <w:szCs w:val="18"/>
               </w:rPr>
-              <w:t xml:space="preserve">Semester 8 - 2018-2019</w:t>
+              <w:t xml:space="preserve">Stage 8 - 2018-2019</w:t>
             </w:r>
           </w:p>
         </w:tc>
@@ -4696,7 +4696,7 @@
                 <w:sz w:val="18"/>
                 <w:szCs w:val="18"/>
               </w:rPr>
-              <w:t xml:space="preserve">53.0</w:t>
+              <w:t xml:space="preserve">53</w:t>
             </w:r>
           </w:p>
         </w:tc>
@@ -4774,7 +4774,7 @@
                 <w:sz w:val="18"/>
                 <w:szCs w:val="18"/>
               </w:rPr>
-              <w:t xml:space="preserve">83.0</w:t>
+              <w:t xml:space="preserve">83</w:t>
             </w:r>
           </w:p>
         </w:tc>
@@ -4857,7 +4857,7 @@
                 <w:sz w:val="18"/>
                 <w:szCs w:val="18"/>
               </w:rPr>
-              <w:t xml:space="preserve">50.0</w:t>
+              <w:t xml:space="preserve">50</w:t>
             </w:r>
           </w:p>
         </w:tc>
@@ -4935,7 +4935,7 @@
                 <w:sz w:val="18"/>
                 <w:szCs w:val="18"/>
               </w:rPr>
-              <w:t xml:space="preserve">76.0</w:t>
+              <w:t xml:space="preserve">76</w:t>
             </w:r>
           </w:p>
         </w:tc>
@@ -5018,7 +5018,7 @@
                 <w:sz w:val="18"/>
                 <w:szCs w:val="18"/>
               </w:rPr>
-              <w:t xml:space="preserve">58.0</w:t>
+              <w:t xml:space="preserve">58</w:t>
             </w:r>
           </w:p>
         </w:tc>
@@ -5096,7 +5096,7 @@
                 <w:sz w:val="18"/>
                 <w:szCs w:val="18"/>
               </w:rPr>
-              <w:t xml:space="preserve">68.0</w:t>
+              <w:t xml:space="preserve">68</w:t>
             </w:r>
           </w:p>
         </w:tc>
@@ -5179,7 +5179,7 @@
                 <w:sz w:val="18"/>
                 <w:szCs w:val="18"/>
               </w:rPr>
-              <w:t xml:space="preserve">75.0</w:t>
+              <w:t xml:space="preserve">75</w:t>
             </w:r>
           </w:p>
         </w:tc>
@@ -5257,7 +5257,7 @@
                 <w:sz w:val="18"/>
                 <w:szCs w:val="18"/>
               </w:rPr>
-              <w:t xml:space="preserve">89.0</w:t>
+              <w:t xml:space="preserve">89</w:t>
             </w:r>
           </w:p>
         </w:tc>
@@ -5340,7 +5340,7 @@
                 <w:sz w:val="18"/>
                 <w:szCs w:val="18"/>
               </w:rPr>
-              <w:t xml:space="preserve">55.0</w:t>
+              <w:t xml:space="preserve">55</w:t>
             </w:r>
           </w:p>
         </w:tc>
@@ -5418,7 +5418,7 @@
                 <w:sz w:val="18"/>
                 <w:szCs w:val="18"/>
               </w:rPr>
-              <w:t xml:space="preserve">68.0</w:t>
+              <w:t xml:space="preserve">68</w:t>
             </w:r>
           </w:p>
         </w:tc>
@@ -5501,7 +5501,7 @@
                 <w:sz w:val="18"/>
                 <w:szCs w:val="18"/>
               </w:rPr>
-              <w:t xml:space="preserve">51.0</w:t>
+              <w:t xml:space="preserve">51</w:t>
             </w:r>
           </w:p>
         </w:tc>
@@ -5579,7 +5579,7 @@
                 <w:sz w:val="18"/>
                 <w:szCs w:val="18"/>
               </w:rPr>
-              <w:t xml:space="preserve">62.0</w:t>
+              <w:t xml:space="preserve">62</w:t>
             </w:r>
           </w:p>
         </w:tc>
@@ -5740,7 +5740,7 @@
                 <w:sz w:val="18"/>
                 <w:szCs w:val="18"/>
               </w:rPr>
-              <w:t xml:space="preserve">64.0</w:t>
+              <w:t xml:space="preserve">64</w:t>
             </w:r>
           </w:p>
         </w:tc>
@@ -5901,7 +5901,7 @@
                 <w:sz w:val="18"/>
                 <w:szCs w:val="18"/>
               </w:rPr>
-              <w:t xml:space="preserve">56.0</w:t>
+              <w:t xml:space="preserve">56</w:t>
             </w:r>
           </w:p>
         </w:tc>
@@ -5986,7 +5986,7 @@
                 <w:sz w:val="18"/>
                 <w:szCs w:val="18"/>
               </w:rPr>
-              <w:t xml:space="preserve">Semester 9 - 2019-2020</w:t>
+              <w:t xml:space="preserve">Stage 9 - 2019-2020</w:t>
             </w:r>
           </w:p>
         </w:tc>
@@ -6231,7 +6231,7 @@
                 <w:sz w:val="18"/>
                 <w:szCs w:val="18"/>
               </w:rPr>
-              <w:t xml:space="preserve">78.0</w:t>
+              <w:t xml:space="preserve">78</w:t>
             </w:r>
           </w:p>
         </w:tc>
@@ -6392,7 +6392,7 @@
                 <w:sz w:val="18"/>
                 <w:szCs w:val="18"/>
               </w:rPr>
-              <w:t xml:space="preserve">98.0</w:t>
+              <w:t xml:space="preserve">98</w:t>
             </w:r>
           </w:p>
         </w:tc>
@@ -6553,7 +6553,7 @@
                 <w:sz w:val="18"/>
                 <w:szCs w:val="18"/>
               </w:rPr>
-              <w:t xml:space="preserve">87.0</w:t>
+              <w:t xml:space="preserve">87</w:t>
             </w:r>
           </w:p>
         </w:tc>
@@ -6714,7 +6714,7 @@
                 <w:sz w:val="18"/>
                 <w:szCs w:val="18"/>
               </w:rPr>
-              <w:t xml:space="preserve">77.0</w:t>
+              <w:t xml:space="preserve">77</w:t>
             </w:r>
           </w:p>
         </w:tc>
@@ -6907,7 +6907,7 @@
                 <w:b/>
                 <w:bCs/>
               </w:rPr>
-              <w:t xml:space="preserve">Lact. Dr. Mortaja A. Saary</w:t>
+              <w:t xml:space="preserve">Lecturer Dr. Mortaja A. Saary</w:t>
             </w:r>
           </w:p>
           <w:p>
@@ -6920,7 +6920,7 @@
               <w:rPr>
                 <w:rFonts w:asciiTheme="majorBidi" w:hAnsiTheme="majorBidi" w:cstheme="majorBidi"/>
               </w:rPr>
-              <w:t xml:space="preserve">Admintion Manager</w:t>
+              <w:t xml:space="preserve">Director of Registration</w:t>
             </w:r>
           </w:p>
         </w:tc>
@@ -7352,7 +7352,7 @@
         <w:rPr>
           <w:rFonts w:asciiTheme="minorBidi" w:hAnsiTheme="minorBidi" w:cstheme="minorBidi"/>
         </w:rPr>
-        <w:t xml:space="preserve">The University order No: 15710/13/3 in 2020-11-17</w:t>
+        <w:t xml:space="preserve">The University order No: 15710/13/3 in ‎2020/11/17‎</w:t>
       </w:r>
     </w:p>
     <w:p>

</xml_diff>